<commit_message>
Finished Bench Press Code
</commit_message>
<xml_diff>
--- a/Jones_Silajdzic_Diplomarbeit.docx
+++ b/Jones_Silajdzic_Diplomarbeit.docx
@@ -240,18 +240,8 @@
           <w:sz w:val="24"/>
           <w:szCs w:val="16"/>
         </w:rPr>
-        <w:t xml:space="preserve">AI Training </w:t>
-      </w:r>
-      <w:proofErr w:type="spellStart"/>
-      <w:r>
-        <w:rPr>
-          <w:b/>
-          <w:sz w:val="24"/>
-          <w:szCs w:val="16"/>
-        </w:rPr>
-        <w:t>Gloves</w:t>
-      </w:r>
-      <w:proofErr w:type="spellEnd"/>
+        <w:t>AI Training Gloves</w:t>
+      </w:r>
     </w:p>
     <w:p>
       <w:pPr>
@@ -684,7 +674,7 @@
         <w:rPr>
           <w:rFonts w:ascii="Times New Roman" w:hAnsi="Times New Roman"/>
           <w:sz w:val="24"/>
-          <w:lang w:val="en-US" w:eastAsia="en-GB"/>
+          <w:lang w:val="de-AT" w:eastAsia="en-GB"/>
         </w:rPr>
       </w:pPr>
       <w:r>
@@ -749,7 +739,7 @@
           <w:rFonts w:cs="Arial"/>
           <w:szCs w:val="22"/>
           <w:shd w:val="clear" w:color="auto" w:fill="FFFFFF"/>
-          <w:lang w:val="en-US" w:eastAsia="en-GB"/>
+          <w:lang w:val="de-AT" w:eastAsia="en-GB"/>
         </w:rPr>
         <w:t>Ausnahmen bedürfen der schriftlichen Genehmigung der Firma XY. </w:t>
       </w:r>
@@ -757,25 +747,16 @@
     <w:p>
       <w:pPr>
         <w:pStyle w:val="StandardTitelseite"/>
-        <w:rPr>
-          <w:lang w:val="en-US"/>
-        </w:rPr>
       </w:pPr>
     </w:p>
     <w:p>
       <w:pPr>
         <w:pStyle w:val="StandardTitelseite"/>
-        <w:rPr>
-          <w:lang w:val="en-US"/>
-        </w:rPr>
       </w:pPr>
     </w:p>
     <w:p>
       <w:pPr>
         <w:pStyle w:val="StandardTitelseite"/>
-        <w:rPr>
-          <w:lang w:val="en-US"/>
-        </w:rPr>
       </w:pPr>
     </w:p>
     <w:p>
@@ -787,18 +768,24 @@
         </w:numPr>
         <w:ind w:left="432" w:hanging="432"/>
         <w:rPr>
-          <w:lang w:val="en-US"/>
+          <w:lang w:val="de-AT"/>
         </w:rPr>
       </w:pPr>
       <w:bookmarkStart w:id="0" w:name="_Toc221128489"/>
       <w:r>
         <w:rPr>
-          <w:lang w:val="en-US"/>
+          <w:lang w:val="de-AT"/>
         </w:rPr>
         <w:lastRenderedPageBreak/>
         <w:t>Abstract</w:t>
       </w:r>
       <w:bookmarkEnd w:id="0"/>
+      <w:r>
+        <w:rPr>
+          <w:lang w:val="de-AT"/>
+        </w:rPr>
+        <w:t xml:space="preserve"> (Kevin)</w:t>
+      </w:r>
     </w:p>
     <w:p>
       <w:pPr>
@@ -904,6 +891,12 @@
         <w:t>Kurzfassung</w:t>
       </w:r>
       <w:bookmarkEnd w:id="2"/>
+      <w:r>
+        <w:rPr>
+          <w:lang w:val="de-AT"/>
+        </w:rPr>
+        <w:t xml:space="preserve"> (Kevin)</w:t>
+      </w:r>
     </w:p>
     <w:p>
       <w:pPr>
@@ -4339,13 +4332,14 @@
         <w:pStyle w:val="berschrift1"/>
       </w:pPr>
       <w:bookmarkStart w:id="3" w:name="_Toc221128491"/>
-      <w:proofErr w:type="spellStart"/>
       <w:r>
         <w:lastRenderedPageBreak/>
         <w:t>Introduction</w:t>
       </w:r>
       <w:bookmarkEnd w:id="3"/>
-      <w:proofErr w:type="spellEnd"/>
+      <w:r>
+        <w:t xml:space="preserve"> (Kevin)</w:t>
+      </w:r>
     </w:p>
     <w:p>
       <w:pPr>
@@ -4398,6 +4392,14 @@
         <w:t>Problem Setting</w:t>
       </w:r>
       <w:bookmarkEnd w:id="4"/>
+      <w:r>
+        <w:rPr>
+          <w:i w:val="0"/>
+          <w:iCs w:val="0"/>
+          <w:lang w:val="en-US"/>
+        </w:rPr>
+        <w:t xml:space="preserve"> (Kevin)</w:t>
+      </w:r>
     </w:p>
     <w:p>
       <w:pPr>
@@ -4670,6 +4672,14 @@
         <w:t>Problem Statement</w:t>
       </w:r>
       <w:bookmarkEnd w:id="5"/>
+      <w:r>
+        <w:rPr>
+          <w:i w:val="0"/>
+          <w:iCs w:val="0"/>
+          <w:lang w:val="en-US"/>
+        </w:rPr>
+        <w:t xml:space="preserve"> (Kevin)</w:t>
+      </w:r>
     </w:p>
     <w:p>
       <w:pPr>
@@ -4832,6 +4842,13 @@
         <w:t>Solution</w:t>
       </w:r>
       <w:bookmarkEnd w:id="6"/>
+      <w:r>
+        <w:rPr>
+          <w:i w:val="0"/>
+          <w:iCs w:val="0"/>
+        </w:rPr>
+        <w:t xml:space="preserve"> (Kevin)</w:t>
+      </w:r>
     </w:p>
     <w:p>
       <w:pPr>
@@ -5094,6 +5111,14 @@
         <w:t>Structure of this Thesis</w:t>
       </w:r>
       <w:bookmarkEnd w:id="7"/>
+      <w:r>
+        <w:rPr>
+          <w:i w:val="0"/>
+          <w:iCs w:val="0"/>
+          <w:lang w:val="en-US"/>
+        </w:rPr>
+        <w:t xml:space="preserve"> </w:t>
+      </w:r>
     </w:p>
     <w:p>
       <w:pPr>
@@ -5157,15 +5182,19 @@
           <w:lang w:val="en-US"/>
         </w:rPr>
       </w:pPr>
-      <w:bookmarkStart w:id="8" w:name="_Toc221128496"/>
       <w:r>
         <w:rPr>
           <w:lang w:val="en-US"/>
         </w:rPr>
         <w:lastRenderedPageBreak/>
-        <w:t>System Overview</w:t>
-      </w:r>
-      <w:bookmarkEnd w:id="8"/>
+        <w:t>Technological Foundation</w:t>
+      </w:r>
+      <w:r>
+        <w:rPr>
+          <w:lang w:val="en-US"/>
+        </w:rPr>
+        <w:t xml:space="preserve"> (Kevin)</w:t>
+      </w:r>
     </w:p>
     <w:p>
       <w:pPr>
@@ -5335,7 +5364,7 @@
           <w:lang w:val="en-US"/>
         </w:rPr>
       </w:pPr>
-      <w:bookmarkStart w:id="9" w:name="_Toc221128497"/>
+      <w:bookmarkStart w:id="8" w:name="_Toc221128497"/>
       <w:r>
         <w:rPr>
           <w:i w:val="0"/>
@@ -5344,53 +5373,105 @@
         </w:rPr>
         <w:t>Arduino Nicla Sense ME</w:t>
       </w:r>
-      <w:bookmarkEnd w:id="9"/>
-    </w:p>
-    <w:p>
-      <w:pPr>
-        <w:rPr>
-          <w:lang w:val="en-US"/>
-        </w:rPr>
-      </w:pPr>
-      <w:r>
-        <w:rPr>
-          <w:lang w:val="en-US"/>
-        </w:rPr>
-        <w:t>The Nicla Sense ME is a microcontroller by Arduino. Its miniscule size is practical for integrating it in smaller devices without creating bulk. It is equipped with various sensors provided by Bosch, including an accelerometer and a gyroscope, which we will be using to track the movement of our gloves. It is also specifically designed for running complex AI-based code, which makes it a perfect fit for our project.</w:t>
-      </w:r>
-      <w:r>
-        <w:rPr>
-          <w:lang w:val="en-US"/>
-        </w:rPr>
-        <w:t xml:space="preserve"> Two of them will be used, one for each glove.</w:t>
-      </w:r>
-    </w:p>
-    <w:p>
-      <w:pPr>
-        <w:rPr>
-          <w:lang w:val="en-US"/>
-        </w:rPr>
-      </w:pPr>
-    </w:p>
-    <w:p>
-      <w:pPr>
-        <w:pStyle w:val="berschrift2"/>
+      <w:bookmarkEnd w:id="8"/>
+      <w:r>
         <w:rPr>
           <w:i w:val="0"/>
           <w:iCs w:val="0"/>
           <w:lang w:val="en-US"/>
         </w:rPr>
-      </w:pPr>
-      <w:bookmarkStart w:id="10" w:name="_Toc221128498"/>
-      <w:r>
+        <w:t xml:space="preserve"> (Daniel)</w:t>
+      </w:r>
+    </w:p>
+    <w:p>
+      <w:pPr>
+        <w:rPr>
+          <w:lang w:val="en-US"/>
+        </w:rPr>
+      </w:pPr>
+      <w:r>
+        <w:rPr>
+          <w:lang w:val="en-US"/>
+        </w:rPr>
+        <w:t>The Nicla Sense ME is a microcontroller by Arduino. Its miniscule size is practical for integrating it in</w:t>
+      </w:r>
+      <w:r>
+        <w:rPr>
+          <w:lang w:val="en-US"/>
+        </w:rPr>
+        <w:t>to</w:t>
+      </w:r>
+      <w:r>
+        <w:rPr>
+          <w:lang w:val="en-US"/>
+        </w:rPr>
+        <w:t xml:space="preserve"> smaller devices without creating bulk. It is equipped with various sensors provided by Bosch, including an accelerometer and a gyroscope, which we will be using to track the movement of our gloves. It is also specifically designed for running complex AI-based code, which makes it a perfect fit for </w:t>
+      </w:r>
+      <w:r>
+        <w:rPr>
+          <w:lang w:val="en-US"/>
+        </w:rPr>
+        <w:t>this</w:t>
+      </w:r>
+      <w:r>
+        <w:rPr>
+          <w:lang w:val="en-US"/>
+        </w:rPr>
+        <w:t xml:space="preserve"> project.</w:t>
+      </w:r>
+      <w:r>
+        <w:rPr>
+          <w:lang w:val="en-US"/>
+        </w:rPr>
+        <w:t xml:space="preserve"> Two of them will </w:t>
+      </w:r>
+      <w:r>
+        <w:rPr>
+          <w:lang w:val="en-US"/>
+        </w:rPr>
+        <w:t>are</w:t>
+      </w:r>
+      <w:r>
+        <w:rPr>
+          <w:lang w:val="en-US"/>
+        </w:rPr>
+        <w:t xml:space="preserve"> used, one for each glove.</w:t>
+      </w:r>
+    </w:p>
+    <w:p>
+      <w:pPr>
+        <w:rPr>
+          <w:lang w:val="en-US"/>
+        </w:rPr>
+      </w:pPr>
+    </w:p>
+    <w:p>
+      <w:pPr>
+        <w:pStyle w:val="berschrift2"/>
         <w:rPr>
           <w:i w:val="0"/>
           <w:iCs w:val="0"/>
           <w:lang w:val="en-US"/>
         </w:rPr>
+      </w:pPr>
+      <w:bookmarkStart w:id="9" w:name="_Toc221128498"/>
+      <w:r>
+        <w:rPr>
+          <w:i w:val="0"/>
+          <w:iCs w:val="0"/>
+          <w:lang w:val="en-US"/>
+        </w:rPr>
         <w:t>Edge Impulse</w:t>
       </w:r>
-      <w:bookmarkEnd w:id="10"/>
+      <w:bookmarkEnd w:id="9"/>
+      <w:r>
+        <w:rPr>
+          <w:i w:val="0"/>
+          <w:iCs w:val="0"/>
+          <w:lang w:val="en-US"/>
+        </w:rPr>
+        <w:t xml:space="preserve"> (Daniel)</w:t>
+      </w:r>
     </w:p>
     <w:p>
       <w:pPr>
@@ -5402,73 +5483,79 @@
         <w:rPr>
           <w:lang w:val="en-GB"/>
         </w:rPr>
-        <w:t xml:space="preserve">Edge Impulse is a development platform for embedded machine learning. It enables the collection, preprocessing, and </w:t>
+        <w:t>Edge Impulse is a development platform for embedded machine learning. It enables the collection, preprocessing, and labelling of sensor data, as well as the training and optimization of AI models directly for microcontrollers.</w:t>
       </w:r>
       <w:r>
         <w:rPr>
           <w:lang w:val="en-GB"/>
         </w:rPr>
-        <w:t>labelling</w:t>
+        <w:t xml:space="preserve"> </w:t>
       </w:r>
       <w:r>
         <w:rPr>
           <w:lang w:val="en-GB"/>
         </w:rPr>
-        <w:t xml:space="preserve"> of sensor data, as well as the training and optimization of AI models directly for microcontrollers.</w:t>
+        <w:t>It will</w:t>
       </w:r>
       <w:r>
         <w:rPr>
           <w:lang w:val="en-GB"/>
         </w:rPr>
-        <w:t xml:space="preserve"> </w:t>
+        <w:t xml:space="preserve"> process the movement data collected and </w:t>
       </w:r>
       <w:r>
         <w:rPr>
           <w:lang w:val="en-GB"/>
         </w:rPr>
-        <w:t>It will</w:t>
+        <w:t xml:space="preserve">help </w:t>
       </w:r>
       <w:r>
         <w:rPr>
           <w:lang w:val="en-GB"/>
         </w:rPr>
-        <w:t xml:space="preserve"> process the movement data collected and </w:t>
+        <w:t>creat</w:t>
       </w:r>
       <w:r>
         <w:rPr>
           <w:lang w:val="en-GB"/>
         </w:rPr>
-        <w:t xml:space="preserve">help </w:t>
+        <w:t>ing</w:t>
       </w:r>
       <w:r>
         <w:rPr>
           <w:lang w:val="en-GB"/>
         </w:rPr>
-        <w:t>creat</w:t>
+        <w:t xml:space="preserve"> a library which can </w:t>
       </w:r>
       <w:r>
         <w:rPr>
           <w:lang w:val="en-GB"/>
         </w:rPr>
-        <w:t>ing</w:t>
+        <w:t xml:space="preserve">be </w:t>
       </w:r>
       <w:r>
         <w:rPr>
           <w:lang w:val="en-GB"/>
         </w:rPr>
-        <w:t xml:space="preserve"> a library which we can directly </w:t>
+        <w:t xml:space="preserve">directly </w:t>
       </w:r>
       <w:r>
         <w:rPr>
           <w:lang w:val="en-GB"/>
         </w:rPr>
-        <w:t>run on our microcontroller.</w:t>
+        <w:t xml:space="preserve">run on </w:t>
       </w:r>
       <w:r>
         <w:rPr>
           <w:lang w:val="en-GB"/>
         </w:rPr>
-        <w:t xml:space="preserve"> </w:t>
+        <w:t>the</w:t>
+      </w:r>
+      <w:r>
+        <w:rPr>
+          <w:lang w:val="en-GB"/>
+        </w:rPr>
+        <w:t xml:space="preserve"> microcontroller.</w:t>
       </w:r>
     </w:p>
     <w:p>
@@ -5489,54 +5576,210 @@
       <w:pPr>
         <w:pStyle w:val="berschrift2"/>
         <w:rPr>
-          <w:lang w:val="en-US"/>
-        </w:rPr>
-      </w:pPr>
-      <w:bookmarkStart w:id="11" w:name="_Toc221128499"/>
-      <w:r>
-        <w:rPr>
+          <w:i w:val="0"/>
+          <w:iCs w:val="0"/>
+          <w:lang w:val="en-US"/>
+        </w:rPr>
+      </w:pPr>
+      <w:bookmarkStart w:id="10" w:name="_Toc221128499"/>
+      <w:r>
+        <w:rPr>
+          <w:i w:val="0"/>
+          <w:iCs w:val="0"/>
           <w:lang w:val="en-US"/>
         </w:rPr>
         <w:lastRenderedPageBreak/>
         <w:t>Smartphone App</w:t>
       </w:r>
+      <w:bookmarkEnd w:id="10"/>
+      <w:r>
+        <w:rPr>
+          <w:i w:val="0"/>
+          <w:iCs w:val="0"/>
+          <w:lang w:val="en-US"/>
+        </w:rPr>
+        <w:t xml:space="preserve"> (Kevin)</w:t>
+      </w:r>
+    </w:p>
+    <w:p>
+      <w:pPr>
+        <w:rPr>
+          <w:lang w:val="en-GB"/>
+        </w:rPr>
+      </w:pPr>
+      <w:r>
+        <w:rPr>
+          <w:lang w:val="en-US"/>
+        </w:rPr>
+        <w:t xml:space="preserve">The user interface (UI) and the logic for workout management are hosted on a mobile application. </w:t>
+      </w:r>
+      <w:r>
+        <w:rPr>
+          <w:lang w:val="en-US"/>
+        </w:rPr>
+        <w:t>T</w:t>
+      </w:r>
+      <w:r>
+        <w:rPr>
+          <w:lang w:val="en-US"/>
+        </w:rPr>
+        <w:t>he "Former" app</w:t>
+      </w:r>
+      <w:r>
+        <w:rPr>
+          <w:lang w:val="en-US"/>
+        </w:rPr>
+        <w:t xml:space="preserve"> was developed using </w:t>
+      </w:r>
+      <w:r>
+        <w:rPr>
+          <w:lang w:val="en-US"/>
+        </w:rPr>
+        <w:t>the Flutter framework in combination with the Dart programming language and the Android Studio integrated development environment (IDE).</w:t>
+      </w:r>
+    </w:p>
+    <w:p>
+      <w:pPr>
+        <w:rPr>
+          <w:lang w:val="en-US"/>
+        </w:rPr>
+      </w:pPr>
+    </w:p>
+    <w:p>
+      <w:pPr>
+        <w:pStyle w:val="berschrift3"/>
+        <w:rPr>
+          <w:sz w:val="28"/>
+          <w:szCs w:val="28"/>
+          <w:lang w:val="en-US"/>
+        </w:rPr>
+      </w:pPr>
+      <w:bookmarkStart w:id="11" w:name="_Toc221128500"/>
+      <w:r>
+        <w:rPr>
+          <w:sz w:val="28"/>
+          <w:szCs w:val="28"/>
+          <w:lang w:val="en-US"/>
+        </w:rPr>
+        <w:t>Flutter Framework</w:t>
+      </w:r>
       <w:bookmarkEnd w:id="11"/>
-    </w:p>
-    <w:p>
-      <w:pPr>
-        <w:rPr>
-          <w:lang w:val="en-US"/>
-        </w:rPr>
-      </w:pPr>
-      <w:r>
-        <w:rPr>
-          <w:lang w:val="en-US"/>
-        </w:rPr>
-        <w:t xml:space="preserve">The user interface (UI) and the logic for workout management are hosted on a mobile application. </w:t>
-      </w:r>
-      <w:r>
-        <w:rPr>
-          <w:lang w:val="en-US"/>
-        </w:rPr>
-        <w:t>T</w:t>
-      </w:r>
-      <w:r>
-        <w:rPr>
-          <w:lang w:val="en-US"/>
-        </w:rPr>
-        <w:t>he "Former" app</w:t>
-      </w:r>
-      <w:r>
-        <w:rPr>
-          <w:lang w:val="en-US"/>
-        </w:rPr>
-        <w:t xml:space="preserve"> was developed using </w:t>
-      </w:r>
-      <w:r>
-        <w:rPr>
-          <w:lang w:val="en-US"/>
-        </w:rPr>
-        <w:t>the Flutter framework in combination with the Dart programming language and the Android Studio integrated development environment (IDE).</w:t>
+      <w:r>
+        <w:rPr>
+          <w:sz w:val="28"/>
+          <w:szCs w:val="28"/>
+          <w:lang w:val="en-US"/>
+        </w:rPr>
+        <w:t xml:space="preserve"> (Kevin)</w:t>
+      </w:r>
+    </w:p>
+    <w:p>
+      <w:pPr>
+        <w:rPr>
+          <w:lang w:val="en-US"/>
+        </w:rPr>
+      </w:pPr>
+      <w:r>
+        <w:rPr>
+          <w:lang w:val="en-US"/>
+        </w:rPr>
+        <w:t xml:space="preserve">Flutter is an open-source UI software development kit (SDK) </w:t>
+      </w:r>
+      <w:r>
+        <w:rPr>
+          <w:lang w:val="en-US"/>
+        </w:rPr>
+        <w:t xml:space="preserve">developed by Google. </w:t>
+      </w:r>
+      <w:r>
+        <w:rPr>
+          <w:lang w:val="en-US"/>
+        </w:rPr>
+        <w:t>It allows developers to build applications for mobile, web, and desktop from a single codebase.</w:t>
+      </w:r>
+      <w:r>
+        <w:rPr>
+          <w:lang w:val="en-US"/>
+        </w:rPr>
+        <w:t xml:space="preserve"> </w:t>
+      </w:r>
+      <w:r>
+        <w:rPr>
+          <w:lang w:val="en-US"/>
+        </w:rPr>
+        <w:t>Unlike traditional development (which would require Kotlin for Android and Swift for iOS), Flutter uses its own rendering engine to draw widgets.</w:t>
+      </w:r>
+      <w:r>
+        <w:rPr>
+          <w:lang w:val="en-US"/>
+        </w:rPr>
+        <w:t xml:space="preserve"> </w:t>
+      </w:r>
+      <w:r>
+        <w:rPr>
+          <w:lang w:val="en-US"/>
+        </w:rPr>
+        <w:t>This makes su</w:t>
+      </w:r>
+      <w:r>
+        <w:rPr>
+          <w:lang w:val="en-US"/>
+        </w:rPr>
+        <w:t>re that the user has</w:t>
+      </w:r>
+      <w:r>
+        <w:rPr>
+          <w:lang w:val="en-US"/>
+        </w:rPr>
+        <w:t xml:space="preserve"> a consistent visual appearance across different devices.</w:t>
+      </w:r>
+      <w:r>
+        <w:rPr>
+          <w:lang w:val="en-US"/>
+        </w:rPr>
+        <w:t xml:space="preserve"> </w:t>
+      </w:r>
+      <w:r>
+        <w:rPr>
+          <w:lang w:val="en-US"/>
+        </w:rPr>
+        <w:t xml:space="preserve">In Flutter, </w:t>
+      </w:r>
+      <w:r>
+        <w:rPr>
+          <w:lang w:val="en-US"/>
+        </w:rPr>
+        <w:t>t</w:t>
+      </w:r>
+      <w:r>
+        <w:rPr>
+          <w:lang w:val="en-US"/>
+        </w:rPr>
+        <w:t>he entire UI is built by nesting widgets (e.g., buttons, text, layout containers) into a tree structure.</w:t>
+      </w:r>
+      <w:r>
+        <w:rPr>
+          <w:lang w:val="en-US"/>
+        </w:rPr>
+        <w:t xml:space="preserve"> </w:t>
+      </w:r>
+      <w:r>
+        <w:rPr>
+          <w:lang w:val="en-US"/>
+        </w:rPr>
+        <w:t xml:space="preserve">This approach is essential for the "Former" app to dynamically rebuild </w:t>
+      </w:r>
+      <w:r>
+        <w:rPr>
+          <w:lang w:val="en-US"/>
+        </w:rPr>
+        <w:t xml:space="preserve">widgets </w:t>
+      </w:r>
+      <w:r>
+        <w:rPr>
+          <w:lang w:val="en-US"/>
+        </w:rPr>
+        <w:t>when new sensor data arrives via Bluetooth.</w:t>
       </w:r>
     </w:p>
     <w:p>
@@ -5550,149 +5793,29 @@
       <w:pPr>
         <w:pStyle w:val="berschrift3"/>
         <w:rPr>
-          <w:lang w:val="en-US"/>
-        </w:rPr>
-      </w:pPr>
-      <w:bookmarkStart w:id="12" w:name="_Toc221128500"/>
-      <w:r>
-        <w:rPr>
-          <w:lang w:val="en-US"/>
-        </w:rPr>
-        <w:t>Flutter Framework</w:t>
+          <w:sz w:val="28"/>
+          <w:szCs w:val="28"/>
+          <w:lang w:val="en-US"/>
+        </w:rPr>
+      </w:pPr>
+      <w:bookmarkStart w:id="12" w:name="_Toc221128501"/>
+      <w:r>
+        <w:rPr>
+          <w:sz w:val="28"/>
+          <w:szCs w:val="28"/>
+          <w:lang w:val="en-US"/>
+        </w:rPr>
+        <w:t>The Dart programming language</w:t>
       </w:r>
       <w:bookmarkEnd w:id="12"/>
-    </w:p>
-    <w:p>
-      <w:pPr>
-        <w:rPr>
-          <w:lang w:val="en-US"/>
-        </w:rPr>
-      </w:pPr>
-      <w:r>
-        <w:rPr>
-          <w:lang w:val="en-US"/>
-        </w:rPr>
-        <w:t xml:space="preserve">Flutter is an open-source UI software development kit (SDK) </w:t>
-      </w:r>
-      <w:r>
-        <w:rPr>
-          <w:lang w:val="en-US"/>
-        </w:rPr>
-        <w:t xml:space="preserve">developed by Google. </w:t>
-      </w:r>
-      <w:r>
-        <w:rPr>
-          <w:lang w:val="en-US"/>
-        </w:rPr>
-        <w:t>It allows developers to build applications for mobile, web, and desktop from a single codebase.</w:t>
-      </w:r>
-      <w:r>
-        <w:rPr>
-          <w:lang w:val="en-US"/>
-        </w:rPr>
-        <w:t xml:space="preserve"> </w:t>
-      </w:r>
-      <w:r>
-        <w:rPr>
-          <w:lang w:val="en-US"/>
-        </w:rPr>
-        <w:t>Unlike traditional development (which would require Kotlin for Android and Swift for iOS), Flutter uses its own rendering engine to draw widgets.</w:t>
-      </w:r>
-      <w:r>
-        <w:rPr>
-          <w:lang w:val="en-US"/>
-        </w:rPr>
-        <w:t xml:space="preserve"> </w:t>
-      </w:r>
-      <w:r>
-        <w:rPr>
-          <w:lang w:val="en-US"/>
-        </w:rPr>
-        <w:t>This makes su</w:t>
-      </w:r>
-      <w:r>
-        <w:rPr>
-          <w:lang w:val="en-US"/>
-        </w:rPr>
-        <w:t>re that the user has</w:t>
-      </w:r>
-      <w:r>
-        <w:rPr>
-          <w:lang w:val="en-US"/>
-        </w:rPr>
-        <w:t xml:space="preserve"> a consistent visual appearance across different devices.</w:t>
-      </w:r>
-      <w:r>
-        <w:rPr>
-          <w:lang w:val="en-US"/>
-        </w:rPr>
-        <w:t xml:space="preserve"> </w:t>
-      </w:r>
-      <w:r>
-        <w:rPr>
-          <w:lang w:val="en-US"/>
-        </w:rPr>
-        <w:t xml:space="preserve">In Flutter, </w:t>
-      </w:r>
-      <w:r>
-        <w:rPr>
-          <w:lang w:val="en-US"/>
-        </w:rPr>
-        <w:t>t</w:t>
-      </w:r>
-      <w:r>
-        <w:rPr>
-          <w:lang w:val="en-US"/>
-        </w:rPr>
-        <w:t>he entire UI is built by nesting widgets (e.g., buttons, text, layout containers) into a tree structure.</w:t>
-      </w:r>
-      <w:r>
-        <w:rPr>
-          <w:lang w:val="en-US"/>
-        </w:rPr>
-        <w:t xml:space="preserve"> </w:t>
-      </w:r>
-      <w:r>
-        <w:rPr>
-          <w:lang w:val="en-US"/>
-        </w:rPr>
-        <w:t xml:space="preserve">This approach is essential for the "Former" app to dynamically rebuild </w:t>
-      </w:r>
-      <w:r>
-        <w:rPr>
-          <w:lang w:val="en-US"/>
-        </w:rPr>
-        <w:t xml:space="preserve">widgets </w:t>
-      </w:r>
-      <w:r>
-        <w:rPr>
-          <w:lang w:val="en-US"/>
-        </w:rPr>
-        <w:t>when new sensor data arrives via Bluetooth.</w:t>
-      </w:r>
-    </w:p>
-    <w:p>
-      <w:pPr>
-        <w:rPr>
-          <w:lang w:val="en-US"/>
-        </w:rPr>
-      </w:pPr>
-    </w:p>
-    <w:p>
-      <w:pPr>
-        <w:pStyle w:val="berschrift3"/>
-        <w:rPr>
-          <w:lang w:val="en-US"/>
-        </w:rPr>
-      </w:pPr>
-      <w:bookmarkStart w:id="13" w:name="_Toc221128501"/>
-      <w:r>
-        <w:rPr>
-          <w:lang w:val="en-US"/>
-        </w:rPr>
-        <w:t>The Dart programming language</w:t>
-      </w:r>
-      <w:bookmarkEnd w:id="13"/>
+      <w:r>
+        <w:rPr>
+          <w:sz w:val="28"/>
+          <w:szCs w:val="28"/>
+          <w:lang w:val="en-US"/>
+        </w:rPr>
+        <w:t xml:space="preserve"> (Kevin)</w:t>
+      </w:r>
     </w:p>
     <w:p>
       <w:pPr>
@@ -5885,29 +6008,41 @@
       <w:pPr>
         <w:pStyle w:val="berschrift3"/>
         <w:rPr>
+          <w:sz w:val="28"/>
+          <w:szCs w:val="28"/>
           <w:lang w:val="en-US" w:eastAsia="de-AT"/>
         </w:rPr>
       </w:pPr>
-      <w:bookmarkStart w:id="14" w:name="_Toc221128502"/>
-      <w:r>
-        <w:rPr>
+      <w:bookmarkStart w:id="13" w:name="_Toc221128502"/>
+      <w:r>
+        <w:rPr>
+          <w:sz w:val="28"/>
+          <w:szCs w:val="28"/>
           <w:lang w:val="en-US" w:eastAsia="de-AT"/>
         </w:rPr>
         <w:lastRenderedPageBreak/>
         <w:t>Android Studio</w:t>
       </w:r>
-      <w:bookmarkEnd w:id="14"/>
-    </w:p>
-    <w:p>
-      <w:pPr>
-        <w:rPr>
+      <w:bookmarkEnd w:id="13"/>
+      <w:r>
+        <w:rPr>
+          <w:sz w:val="28"/>
+          <w:szCs w:val="28"/>
           <w:lang w:val="en-US" w:eastAsia="de-AT"/>
         </w:rPr>
-      </w:pPr>
-      <w:r>
+        <w:t xml:space="preserve"> (Kevin)</w:t>
+      </w:r>
+    </w:p>
+    <w:p>
+      <w:pPr>
         <w:rPr>
           <w:lang w:val="en-US" w:eastAsia="de-AT"/>
         </w:rPr>
+      </w:pPr>
+      <w:r>
+        <w:rPr>
+          <w:lang w:val="en-US" w:eastAsia="de-AT"/>
+        </w:rPr>
         <w:t>The</w:t>
       </w:r>
       <w:r>
@@ -5981,77 +6116,708 @@
         <w:rPr>
           <w:lang w:val="en-US" w:eastAsia="de-AT"/>
         </w:rPr>
+        <w:t xml:space="preserve"> </w:t>
+      </w:r>
+      <w:r>
+        <w:rPr>
+          <w:lang w:val="en-US" w:eastAsia="de-AT"/>
+        </w:rPr>
+        <w:t>Android Studio includes an integrated device emulat</w:t>
+      </w:r>
+      <w:r>
+        <w:rPr>
+          <w:lang w:val="en-US" w:eastAsia="de-AT"/>
+        </w:rPr>
+        <w:t xml:space="preserve">or for virtual testing, this project relies heavily on the Android Debugging Bridge (ADB), which </w:t>
+      </w:r>
+      <w:r>
+        <w:rPr>
+          <w:lang w:val="en-US" w:eastAsia="de-AT"/>
+        </w:rPr>
+        <w:t>acts as a</w:t>
+      </w:r>
+      <w:r>
+        <w:rPr>
+          <w:lang w:val="en-US" w:eastAsia="de-AT"/>
+        </w:rPr>
+        <w:t xml:space="preserve">n interface </w:t>
+      </w:r>
+      <w:r>
+        <w:rPr>
+          <w:lang w:val="en-US" w:eastAsia="de-AT"/>
+        </w:rPr>
+        <w:t>between the development environment and the physical device</w:t>
+      </w:r>
+      <w:r>
+        <w:rPr>
+          <w:lang w:val="en-US" w:eastAsia="de-AT"/>
+        </w:rPr>
+        <w:t>. Since standard emulators don’t support the use of Bluetooth connections</w:t>
+      </w:r>
+      <w:r>
+        <w:rPr>
+          <w:lang w:val="en-US" w:eastAsia="de-AT"/>
+        </w:rPr>
+        <w:t>, uploading the application to a smartphone was essential for testing the</w:t>
+      </w:r>
+      <w:r>
+        <w:rPr>
+          <w:lang w:val="en-US" w:eastAsia="de-AT"/>
+        </w:rPr>
+        <w:t xml:space="preserve"> communication with the Former Glove.</w:t>
+      </w:r>
+    </w:p>
+    <w:p>
+      <w:pPr>
+        <w:rPr>
+          <w:lang w:val="en-US" w:eastAsia="de-AT"/>
+        </w:rPr>
+      </w:pPr>
+    </w:p>
+    <w:p>
+      <w:pPr>
+        <w:pStyle w:val="berschrift2"/>
+        <w:rPr>
+          <w:i w:val="0"/>
+          <w:iCs w:val="0"/>
+          <w:lang w:val="en-US" w:eastAsia="de-AT"/>
+        </w:rPr>
+      </w:pPr>
+      <w:r>
+        <w:rPr>
+          <w:i w:val="0"/>
+          <w:iCs w:val="0"/>
+          <w:lang w:val="en-US" w:eastAsia="de-AT"/>
+        </w:rPr>
+        <w:t>Communication Protocols (Bluetooth Low Energy)</w:t>
+      </w:r>
+      <w:r>
+        <w:rPr>
+          <w:i w:val="0"/>
+          <w:iCs w:val="0"/>
+          <w:lang w:val="en-US" w:eastAsia="de-AT"/>
+        </w:rPr>
+        <w:t xml:space="preserve"> (Kevin)</w:t>
+      </w:r>
+    </w:p>
+    <w:p>
+      <w:pPr>
+        <w:spacing w:before="100" w:beforeAutospacing="1" w:after="100" w:afterAutospacing="1"/>
+        <w:jc w:val="left"/>
+        <w:rPr>
+          <w:rFonts w:cs="Arial"/>
+          <w:szCs w:val="22"/>
+          <w:lang w:val="en-US" w:eastAsia="de-AT"/>
+        </w:rPr>
+      </w:pPr>
+      <w:r>
+        <w:rPr>
+          <w:rFonts w:cs="Arial"/>
+          <w:szCs w:val="22"/>
+          <w:lang w:val="en-US" w:eastAsia="de-AT"/>
+        </w:rPr>
+        <w:t xml:space="preserve">For the wireless data transmission between the wearable hardware and the mobile application, Bluetooth Low Energy </w:t>
+      </w:r>
+      <w:r>
+        <w:rPr>
+          <w:rFonts w:cs="Arial"/>
+          <w:szCs w:val="22"/>
+          <w:lang w:val="en-US" w:eastAsia="de-AT"/>
+        </w:rPr>
+        <w:t xml:space="preserve">(BLE) </w:t>
+      </w:r>
+      <w:r>
+        <w:rPr>
+          <w:rFonts w:cs="Arial"/>
+          <w:szCs w:val="22"/>
+          <w:lang w:val="en-US" w:eastAsia="de-AT"/>
+        </w:rPr>
+        <w:t xml:space="preserve">was selected as the communication standard. BLE is specifically designed for applications requiring low power consumption and sporadic data transfer, making it the industry standard for </w:t>
+      </w:r>
+      <w:r>
+        <w:rPr>
+          <w:rFonts w:cs="Arial"/>
+          <w:szCs w:val="22"/>
+          <w:lang w:val="en-US" w:eastAsia="de-AT"/>
+        </w:rPr>
+        <w:t>fitness</w:t>
+      </w:r>
+      <w:r>
+        <w:rPr>
+          <w:rFonts w:cs="Arial"/>
+          <w:szCs w:val="22"/>
+          <w:lang w:val="en-US" w:eastAsia="de-AT"/>
+        </w:rPr>
+        <w:t xml:space="preserve"> wearables.</w:t>
+      </w:r>
+    </w:p>
+    <w:p>
+      <w:pPr>
+        <w:spacing w:before="100" w:beforeAutospacing="1" w:after="100" w:afterAutospacing="1"/>
+        <w:jc w:val="left"/>
+        <w:rPr>
+          <w:rFonts w:cs="Arial"/>
+          <w:szCs w:val="22"/>
+          <w:lang w:val="en-US" w:eastAsia="de-AT"/>
+        </w:rPr>
+      </w:pPr>
+      <w:r>
+        <w:rPr>
+          <w:rFonts w:cs="Arial"/>
+          <w:szCs w:val="22"/>
+          <w:lang w:val="en-US" w:eastAsia="de-AT"/>
+        </w:rPr>
+        <w:t>Unlike</w:t>
+      </w:r>
+      <w:r>
+        <w:rPr>
+          <w:rFonts w:cs="Arial"/>
+          <w:szCs w:val="22"/>
+          <w:lang w:val="en-US" w:eastAsia="de-AT"/>
+        </w:rPr>
+        <w:t xml:space="preserve"> classic</w:t>
+      </w:r>
+      <w:r>
+        <w:rPr>
+          <w:rFonts w:cs="Arial"/>
+          <w:szCs w:val="22"/>
+          <w:lang w:val="en-US" w:eastAsia="de-AT"/>
+        </w:rPr>
+        <w:t xml:space="preserve"> Bluetooth, which is optimized for continuous data streaming (e.g., audio), BLE remains in sleep mode for the majority of the time and only wakes up to transmit short bursts of data. This characteristic is essential for the Former Glove</w:t>
+      </w:r>
+      <w:r>
+        <w:rPr>
+          <w:rFonts w:cs="Arial"/>
+          <w:szCs w:val="22"/>
+          <w:lang w:val="en-US" w:eastAsia="de-AT"/>
+        </w:rPr>
         <w:t>,</w:t>
       </w:r>
       <w:r>
         <w:rPr>
+          <w:rFonts w:cs="Arial"/>
+          <w:szCs w:val="22"/>
           <w:lang w:val="en-US" w:eastAsia="de-AT"/>
         </w:rPr>
-        <w:t xml:space="preserve"> Android Studio includes an integrated device emulat</w:t>
-      </w:r>
-      <w:r>
-        <w:rPr>
+        <w:t xml:space="preserve"> as it allows the Nicla Sense ME to operate </w:t>
+      </w:r>
+      <w:r>
+        <w:rPr>
+          <w:rFonts w:cs="Arial"/>
+          <w:szCs w:val="22"/>
           <w:lang w:val="en-US" w:eastAsia="de-AT"/>
         </w:rPr>
-        <w:t xml:space="preserve">or for virtual testing, this project relies heavily on the Android Debugging Bridge (ADB), which </w:t>
-      </w:r>
-      <w:r>
-        <w:rPr>
+        <w:t>with</w:t>
+      </w:r>
+      <w:r>
+        <w:rPr>
+          <w:rFonts w:cs="Arial"/>
+          <w:szCs w:val="22"/>
           <w:lang w:val="en-US" w:eastAsia="de-AT"/>
         </w:rPr>
-        <w:t>acts as a</w:t>
-      </w:r>
-      <w:r>
-        <w:rPr>
+        <w:t xml:space="preserve"> a </w:t>
+      </w:r>
+      <w:r>
+        <w:rPr>
+          <w:rFonts w:cs="Arial"/>
+          <w:szCs w:val="22"/>
           <w:lang w:val="en-US" w:eastAsia="de-AT"/>
         </w:rPr>
-        <w:t xml:space="preserve">n interface </w:t>
-      </w:r>
-      <w:r>
-        <w:rPr>
+        <w:t>minimal</w:t>
+      </w:r>
+      <w:r>
+        <w:rPr>
+          <w:rFonts w:cs="Arial"/>
+          <w:szCs w:val="22"/>
           <w:lang w:val="en-US" w:eastAsia="de-AT"/>
         </w:rPr>
-        <w:t>between the development environment and the physical device</w:t>
-      </w:r>
-      <w:r>
-        <w:rPr>
+        <w:t xml:space="preserve"> battery </w:t>
+      </w:r>
+      <w:r>
+        <w:rPr>
+          <w:rFonts w:cs="Arial"/>
+          <w:szCs w:val="22"/>
           <w:lang w:val="en-US" w:eastAsia="de-AT"/>
         </w:rPr>
-        <w:t>. Since standard emulators don’t support the use of Bluetooth connections</w:t>
-      </w:r>
-      <w:r>
-        <w:rPr>
+        <w:t xml:space="preserve">consumption </w:t>
+      </w:r>
+      <w:r>
+        <w:rPr>
+          <w:rFonts w:cs="Arial"/>
+          <w:szCs w:val="22"/>
           <w:lang w:val="en-US" w:eastAsia="de-AT"/>
         </w:rPr>
-        <w:t>, uploading the application to a smartphone was essential for testing the</w:t>
-      </w:r>
-      <w:r>
-        <w:rPr>
+        <w:t>while maintaining a connection over the duration of a workout session.</w:t>
+      </w:r>
+    </w:p>
+    <w:p>
+      <w:pPr>
+        <w:spacing w:before="100" w:beforeAutospacing="1" w:after="100" w:afterAutospacing="1"/>
+        <w:jc w:val="left"/>
+        <w:rPr>
+          <w:rFonts w:cs="Arial"/>
+          <w:szCs w:val="22"/>
           <w:lang w:val="en-US" w:eastAsia="de-AT"/>
         </w:rPr>
-        <w:t xml:space="preserve"> communication with the Former Glove.</w:t>
-      </w:r>
-    </w:p>
-    <w:p>
-      <w:pPr>
-        <w:rPr>
+      </w:pPr>
+    </w:p>
+    <w:p>
+      <w:pPr>
+        <w:spacing w:before="100" w:beforeAutospacing="1" w:after="100" w:afterAutospacing="1"/>
+        <w:jc w:val="left"/>
+        <w:rPr>
+          <w:rFonts w:cs="Arial"/>
+          <w:szCs w:val="22"/>
           <w:lang w:val="en-US" w:eastAsia="de-AT"/>
         </w:rPr>
       </w:pPr>
     </w:p>
     <w:p>
       <w:pPr>
-        <w:rPr>
+        <w:spacing w:before="100" w:beforeAutospacing="1" w:after="100" w:afterAutospacing="1"/>
+        <w:jc w:val="left"/>
+        <w:rPr>
+          <w:rFonts w:cs="Arial"/>
+          <w:szCs w:val="22"/>
           <w:lang w:val="en-US" w:eastAsia="de-AT"/>
         </w:rPr>
       </w:pPr>
     </w:p>
     <w:p>
       <w:pPr>
+        <w:pStyle w:val="berschrift3"/>
         <w:rPr>
           <w:lang w:val="en-US" w:eastAsia="de-AT"/>
         </w:rPr>
       </w:pPr>
+      <w:r>
+        <w:rPr>
+          <w:lang w:val="en-US" w:eastAsia="de-AT"/>
+        </w:rPr>
+        <w:lastRenderedPageBreak/>
+        <w:t>Generic Access Profile (GAP)</w:t>
+      </w:r>
+    </w:p>
+    <w:p>
+      <w:pPr>
+        <w:rPr>
+          <w:lang w:val="en-US" w:eastAsia="de-AT"/>
+        </w:rPr>
+      </w:pPr>
+      <w:r>
+        <w:rPr>
+          <w:lang w:val="en-US" w:eastAsia="de-AT"/>
+        </w:rPr>
+        <w:t xml:space="preserve">The Generic Access Profile (GAP) defines how devices discover each other and establish a connection. In this </w:t>
+      </w:r>
+      <w:r>
+        <w:rPr>
+          <w:lang w:val="en-US" w:eastAsia="de-AT"/>
+        </w:rPr>
+        <w:t>project</w:t>
+      </w:r>
+      <w:r>
+        <w:rPr>
+          <w:lang w:val="en-US" w:eastAsia="de-AT"/>
+        </w:rPr>
+        <w:t>, the system architecture assigns specific roles to the hardware components:</w:t>
+      </w:r>
+    </w:p>
+    <w:p>
+      <w:pPr>
+        <w:numPr>
+          <w:ilvl w:val="0"/>
+          <w:numId w:val="32"/>
+        </w:numPr>
+        <w:rPr>
+          <w:lang w:val="de-AT" w:eastAsia="de-AT"/>
+        </w:rPr>
+      </w:pPr>
+      <w:r>
+        <w:rPr>
+          <w:b/>
+          <w:bCs/>
+          <w:lang w:val="en-US" w:eastAsia="de-AT"/>
+        </w:rPr>
+        <w:t>Peripheral (The Glove):</w:t>
+      </w:r>
+      <w:r>
+        <w:rPr>
+          <w:lang w:val="en-US" w:eastAsia="de-AT"/>
+        </w:rPr>
+        <w:t xml:space="preserve"> The Nicla Sense ME acts as the Peripheral. It is a low-power device that "advertises" its presence by broadcasting small data packets containing its name ("LeftGlove") and available services. </w:t>
+      </w:r>
+      <w:r>
+        <w:rPr>
+          <w:lang w:val="de-AT" w:eastAsia="de-AT"/>
+        </w:rPr>
+        <w:t>It waits for a connection request.</w:t>
+      </w:r>
+    </w:p>
+    <w:p>
+      <w:pPr>
+        <w:numPr>
+          <w:ilvl w:val="0"/>
+          <w:numId w:val="32"/>
+        </w:numPr>
+        <w:rPr>
+          <w:lang w:val="en-US" w:eastAsia="de-AT"/>
+        </w:rPr>
+      </w:pPr>
+      <w:r>
+        <w:rPr>
+          <w:b/>
+          <w:bCs/>
+          <w:lang w:val="en-US" w:eastAsia="de-AT"/>
+        </w:rPr>
+        <w:t>Central (The Smartphone):</w:t>
+      </w:r>
+      <w:r>
+        <w:rPr>
+          <w:lang w:val="en-US" w:eastAsia="de-AT"/>
+        </w:rPr>
+        <w:t xml:space="preserve"> The mobile device running the Flutter application acts as the Central. It has higher processing power and battery capacity. Its role is to scan for advertising packets, initiate the connection, and manage the communication timing.</w:t>
+      </w:r>
+    </w:p>
+    <w:p>
+      <w:pPr>
+        <w:rPr>
+          <w:lang w:val="en-US" w:eastAsia="de-AT"/>
+        </w:rPr>
+      </w:pPr>
+    </w:p>
+    <w:p>
+      <w:pPr>
+        <w:pStyle w:val="berschrift3"/>
+        <w:rPr>
+          <w:lang w:val="en-US" w:eastAsia="de-AT"/>
+        </w:rPr>
+      </w:pPr>
+      <w:r>
+        <w:rPr>
+          <w:lang w:val="en-US" w:eastAsia="de-AT"/>
+        </w:rPr>
+        <w:t>Generic Attribute Profile (GATT)</w:t>
+      </w:r>
+    </w:p>
+    <w:p>
+      <w:pPr>
+        <w:rPr>
+          <w:lang w:val="de-AT" w:eastAsia="de-AT"/>
+        </w:rPr>
+      </w:pPr>
+      <w:r>
+        <w:rPr>
+          <w:lang w:val="en-US" w:eastAsia="de-AT"/>
+        </w:rPr>
+        <w:t xml:space="preserve">Once a connection is established via GAP, the </w:t>
+      </w:r>
+      <w:r>
+        <w:rPr>
+          <w:b/>
+          <w:bCs/>
+          <w:lang w:val="en-US" w:eastAsia="de-AT"/>
+        </w:rPr>
+        <w:t>Generic Attribute Profile (GATT)</w:t>
+      </w:r>
+      <w:r>
+        <w:rPr>
+          <w:lang w:val="en-US" w:eastAsia="de-AT"/>
+        </w:rPr>
+        <w:t xml:space="preserve"> defines how data is structured and exchanged. </w:t>
+      </w:r>
+      <w:r>
+        <w:rPr>
+          <w:lang w:val="de-AT" w:eastAsia="de-AT"/>
+        </w:rPr>
+        <w:t xml:space="preserve">GATT organizes data hierarchically into </w:t>
+      </w:r>
+      <w:r>
+        <w:rPr>
+          <w:b/>
+          <w:bCs/>
+          <w:lang w:val="de-AT" w:eastAsia="de-AT"/>
+        </w:rPr>
+        <w:t>Services</w:t>
+      </w:r>
+      <w:r>
+        <w:rPr>
+          <w:lang w:val="de-AT" w:eastAsia="de-AT"/>
+        </w:rPr>
+        <w:t xml:space="preserve"> and </w:t>
+      </w:r>
+      <w:r>
+        <w:rPr>
+          <w:b/>
+          <w:bCs/>
+          <w:lang w:val="de-AT" w:eastAsia="de-AT"/>
+        </w:rPr>
+        <w:t>Characteristics</w:t>
+      </w:r>
+      <w:r>
+        <w:rPr>
+          <w:lang w:val="de-AT" w:eastAsia="de-AT"/>
+        </w:rPr>
+        <w:t>:</w:t>
+      </w:r>
+    </w:p>
+    <w:p>
+      <w:pPr>
+        <w:numPr>
+          <w:ilvl w:val="0"/>
+          <w:numId w:val="33"/>
+        </w:numPr>
+        <w:rPr>
+          <w:lang w:val="en-US" w:eastAsia="de-AT"/>
+        </w:rPr>
+      </w:pPr>
+      <w:r>
+        <w:rPr>
+          <w:b/>
+          <w:bCs/>
+          <w:lang w:val="en-US" w:eastAsia="de-AT"/>
+        </w:rPr>
+        <w:t>Services:</w:t>
+      </w:r>
+      <w:r>
+        <w:rPr>
+          <w:lang w:val="en-US" w:eastAsia="de-AT"/>
+        </w:rPr>
+        <w:t xml:space="preserve"> A Service is a logical collection of data and behaviors to accomplish a specific function. For this project, a custom "Training Service" was defined and identified by a unique UUID (Universally Unique Identifier).</w:t>
+      </w:r>
+    </w:p>
+    <w:p>
+      <w:pPr>
+        <w:numPr>
+          <w:ilvl w:val="0"/>
+          <w:numId w:val="33"/>
+        </w:numPr>
+        <w:rPr>
+          <w:lang w:val="en-US" w:eastAsia="de-AT"/>
+        </w:rPr>
+      </w:pPr>
+      <w:r>
+        <w:rPr>
+          <w:b/>
+          <w:bCs/>
+          <w:lang w:val="en-US" w:eastAsia="de-AT"/>
+        </w:rPr>
+        <w:t>Characteristics:</w:t>
+      </w:r>
+      <w:r>
+        <w:rPr>
+          <w:lang w:val="en-US" w:eastAsia="de-AT"/>
+        </w:rPr>
+        <w:t xml:space="preserve"> Characteristics are the actual data containers within a Service. They hold values (e.g., the repetition count or the sensor feedback) and properties that define how this value can be accessed (Read, Write, or Notify).</w:t>
+      </w:r>
+    </w:p>
+    <w:p>
+      <w:pPr>
+        <w:numPr>
+          <w:ilvl w:val="0"/>
+          <w:numId w:val="33"/>
+        </w:numPr>
+        <w:rPr>
+          <w:lang w:val="en-US" w:eastAsia="de-AT"/>
+        </w:rPr>
+      </w:pPr>
+      <w:r>
+        <w:rPr>
+          <w:b/>
+          <w:bCs/>
+          <w:lang w:val="en-US" w:eastAsia="de-AT"/>
+        </w:rPr>
+        <w:t>UUIDs:</w:t>
+      </w:r>
+      <w:r>
+        <w:rPr>
+          <w:lang w:val="en-US" w:eastAsia="de-AT"/>
+        </w:rPr>
+        <w:t xml:space="preserve"> To ensure that the app communicates with the correct data points, both the Service and its Characteristics are addressed via predefined UUIDs known to both the firmware and the app software.</w:t>
+      </w:r>
+    </w:p>
+    <w:p>
+      <w:pPr>
+        <w:rPr>
+          <w:lang w:val="en-US" w:eastAsia="de-AT"/>
+        </w:rPr>
+      </w:pPr>
+    </w:p>
+    <w:p>
+      <w:pPr>
+        <w:pStyle w:val="berschrift3"/>
+        <w:rPr>
+          <w:lang w:val="en-US" w:eastAsia="de-AT"/>
+        </w:rPr>
+      </w:pPr>
+      <w:r>
+        <w:rPr>
+          <w:lang w:val="en-US" w:eastAsia="de-AT"/>
+        </w:rPr>
+        <w:lastRenderedPageBreak/>
+        <w:t>Data Transmission Mechanism: Notifications</w:t>
+      </w:r>
+    </w:p>
+    <w:p>
+      <w:pPr>
+        <w:spacing w:before="100" w:beforeAutospacing="1" w:after="100" w:afterAutospacing="1"/>
+        <w:jc w:val="left"/>
+        <w:rPr>
+          <w:rFonts w:cs="Arial"/>
+          <w:szCs w:val="22"/>
+          <w:lang w:val="en-US" w:eastAsia="de-AT"/>
+        </w:rPr>
+      </w:pPr>
+      <w:r>
+        <w:rPr>
+          <w:rFonts w:cs="Arial"/>
+          <w:szCs w:val="22"/>
+          <w:lang w:val="en-US" w:eastAsia="de-AT"/>
+        </w:rPr>
+        <w:t>Efficient data transfer is critical for real</w:t>
+      </w:r>
+      <w:r>
+        <w:rPr>
+          <w:rFonts w:cs="Arial"/>
+          <w:szCs w:val="22"/>
+          <w:lang w:val="en-US" w:eastAsia="de-AT"/>
+        </w:rPr>
+        <w:t xml:space="preserve"> </w:t>
+      </w:r>
+      <w:r>
+        <w:rPr>
+          <w:rFonts w:cs="Arial"/>
+          <w:szCs w:val="22"/>
+          <w:lang w:val="en-US" w:eastAsia="de-AT"/>
+        </w:rPr>
+        <w:t xml:space="preserve">time feedback. Standard polling (where the app constantly asks "Do you have new data?") is inefficient and increases latency. Instead, this project utilizes the </w:t>
+      </w:r>
+      <w:r>
+        <w:rPr>
+          <w:rFonts w:cs="Arial"/>
+          <w:szCs w:val="22"/>
+          <w:lang w:val="en-US" w:eastAsia="de-AT"/>
+        </w:rPr>
+        <w:t>n</w:t>
+      </w:r>
+      <w:r>
+        <w:rPr>
+          <w:rFonts w:cs="Arial"/>
+          <w:szCs w:val="22"/>
+          <w:lang w:val="en-US" w:eastAsia="de-AT"/>
+        </w:rPr>
+        <w:t xml:space="preserve">otification mechanism provided by BLE. The smartphone "subscribes" to the specific </w:t>
+      </w:r>
+      <w:r>
+        <w:rPr>
+          <w:rFonts w:cs="Arial"/>
+          <w:szCs w:val="22"/>
+          <w:lang w:val="en-US" w:eastAsia="de-AT"/>
+        </w:rPr>
+        <w:t>c</w:t>
+      </w:r>
+      <w:r>
+        <w:rPr>
+          <w:rFonts w:cs="Arial"/>
+          <w:szCs w:val="22"/>
+          <w:lang w:val="en-US" w:eastAsia="de-AT"/>
+        </w:rPr>
+        <w:t xml:space="preserve">haracteristic of the glove. Whenever the glove’s internal logic detects a new event (e.g., a completed repetition), it actively pushes the update to the smartphone. This event-driven architecture ensures that the application interface updates instantly while minimizing the </w:t>
+      </w:r>
+      <w:r>
+        <w:rPr>
+          <w:rFonts w:cs="Arial"/>
+          <w:szCs w:val="22"/>
+          <w:lang w:val="en-US" w:eastAsia="de-AT"/>
+        </w:rPr>
+        <w:t>Bluetooth</w:t>
+      </w:r>
+      <w:r>
+        <w:rPr>
+          <w:rFonts w:cs="Arial"/>
+          <w:szCs w:val="22"/>
+          <w:lang w:val="en-US" w:eastAsia="de-AT"/>
+        </w:rPr>
+        <w:t xml:space="preserve"> usage of the microcontroller.</w:t>
+      </w:r>
+    </w:p>
+    <w:p>
+      <w:pPr>
+        <w:spacing w:before="100" w:beforeAutospacing="1" w:after="100" w:afterAutospacing="1"/>
+        <w:jc w:val="left"/>
+        <w:rPr>
+          <w:rFonts w:cs="Arial"/>
+          <w:szCs w:val="22"/>
+          <w:lang w:val="en-US" w:eastAsia="de-AT"/>
+        </w:rPr>
+      </w:pPr>
+    </w:p>
+    <w:p>
+      <w:pPr>
+        <w:spacing w:before="100" w:beforeAutospacing="1" w:after="100" w:afterAutospacing="1"/>
+        <w:jc w:val="left"/>
+        <w:rPr>
+          <w:rFonts w:cs="Arial"/>
+          <w:szCs w:val="22"/>
+          <w:lang w:val="en-US" w:eastAsia="de-AT"/>
+        </w:rPr>
+      </w:pPr>
+    </w:p>
+    <w:p>
+      <w:pPr>
+        <w:rPr>
+          <w:lang w:val="en-US" w:eastAsia="de-AT"/>
+        </w:rPr>
+      </w:pPr>
+    </w:p>
+    <w:p>
+      <w:pPr>
+        <w:rPr>
+          <w:lang w:val="en-US" w:eastAsia="de-AT"/>
+        </w:rPr>
+      </w:pPr>
+    </w:p>
+    <w:p>
+      <w:pPr>
+        <w:rPr>
+          <w:lang w:val="en-US" w:eastAsia="de-AT"/>
+        </w:rPr>
+      </w:pPr>
+    </w:p>
+    <w:p>
+      <w:pPr>
+        <w:rPr>
+          <w:lang w:val="en-US" w:eastAsia="de-AT"/>
+        </w:rPr>
+      </w:pPr>
+    </w:p>
+    <w:p>
+      <w:pPr>
+        <w:rPr>
+          <w:lang w:val="en-US" w:eastAsia="de-AT"/>
+        </w:rPr>
+      </w:pPr>
+    </w:p>
+    <w:p>
+      <w:pPr>
+        <w:rPr>
+          <w:lang w:val="en-US" w:eastAsia="de-AT"/>
+        </w:rPr>
+      </w:pPr>
+    </w:p>
+    <w:p>
+      <w:pPr>
+        <w:rPr>
+          <w:lang w:val="en-US" w:eastAsia="de-AT"/>
+        </w:rPr>
+      </w:pPr>
+    </w:p>
+    <w:p>
+      <w:pPr>
+        <w:rPr>
+          <w:lang w:val="en-US" w:eastAsia="de-AT"/>
+        </w:rPr>
+      </w:pPr>
     </w:p>
     <w:p>
       <w:pPr>
@@ -6074,15 +6840,13 @@
           <w:lang w:val="en-US"/>
         </w:rPr>
       </w:pPr>
-      <w:bookmarkStart w:id="15" w:name="_Toc221128503"/>
       <w:r>
         <w:rPr>
           <w:lang w:val="en-US"/>
         </w:rPr>
         <w:lastRenderedPageBreak/>
-        <w:t>Content A</w:t>
-      </w:r>
-      <w:bookmarkEnd w:id="15"/>
+        <w:t>System Design</w:t>
+      </w:r>
     </w:p>
     <w:p>
       <w:r>
@@ -6107,15 +6871,347 @@
     <w:p>
       <w:pPr>
         <w:pStyle w:val="berschrift2"/>
-      </w:pPr>
-      <w:bookmarkStart w:id="16" w:name="_Toc221128504"/>
-      <w:r>
-        <w:rPr>
-          <w:lang w:val="en-US"/>
-        </w:rPr>
-        <w:t>Content A1</w:t>
-      </w:r>
-      <w:bookmarkEnd w:id="16"/>
+        <w:rPr>
+          <w:i w:val="0"/>
+          <w:iCs w:val="0"/>
+        </w:rPr>
+      </w:pPr>
+      <w:r>
+        <w:rPr>
+          <w:i w:val="0"/>
+          <w:iCs w:val="0"/>
+          <w:lang w:val="en-US"/>
+        </w:rPr>
+        <w:t>Data Flow Diagram</w:t>
+      </w:r>
+      <w:r>
+        <w:rPr>
+          <w:i w:val="0"/>
+          <w:iCs w:val="0"/>
+          <w:lang w:val="en-US"/>
+        </w:rPr>
+        <w:t xml:space="preserve"> (Daniel)</w:t>
+      </w:r>
+    </w:p>
+    <w:p>
+      <w:pPr>
+        <w:rPr>
+          <w:lang w:val="en-US"/>
+        </w:rPr>
+      </w:pPr>
+      <w:r>
+        <w:rPr>
+          <w:noProof/>
+        </w:rPr>
+        <mc:AlternateContent>
+          <mc:Choice Requires="wps">
+            <w:drawing>
+              <wp:anchor distT="0" distB="0" distL="114300" distR="114300" simplePos="0" relativeHeight="251676672" behindDoc="0" locked="0" layoutInCell="1" allowOverlap="1" wp14:anchorId="06733E0C" wp14:editId="0E201041">
+                <wp:simplePos x="0" y="0"/>
+                <wp:positionH relativeFrom="column">
+                  <wp:posOffset>1266190</wp:posOffset>
+                </wp:positionH>
+                <wp:positionV relativeFrom="paragraph">
+                  <wp:posOffset>4525010</wp:posOffset>
+                </wp:positionV>
+                <wp:extent cx="3227070" cy="635"/>
+                <wp:effectExtent l="0" t="0" r="0" b="0"/>
+                <wp:wrapTopAndBottom/>
+                <wp:docPr id="5450302" name="Textfeld 1"/>
+                <wp:cNvGraphicFramePr/>
+                <a:graphic xmlns:a="http://schemas.openxmlformats.org/drawingml/2006/main">
+                  <a:graphicData uri="http://schemas.microsoft.com/office/word/2010/wordprocessingShape">
+                    <wps:wsp>
+                      <wps:cNvSpPr txBox="1"/>
+                      <wps:spPr>
+                        <a:xfrm>
+                          <a:off x="0" y="0"/>
+                          <a:ext cx="3227070" cy="635"/>
+                        </a:xfrm>
+                        <a:prstGeom prst="rect">
+                          <a:avLst/>
+                        </a:prstGeom>
+                        <a:solidFill>
+                          <a:prstClr val="white"/>
+                        </a:solidFill>
+                        <a:ln>
+                          <a:noFill/>
+                        </a:ln>
+                      </wps:spPr>
+                      <wps:txbx>
+                        <w:txbxContent>
+                          <w:p>
+                            <w:pPr>
+                              <w:pStyle w:val="Beschriftung"/>
+                              <w:jc w:val="center"/>
+                              <w:rPr>
+                                <w:noProof/>
+                                <w:sz w:val="22"/>
+                                <w:lang w:val="en-US"/>
+                              </w:rPr>
+                            </w:pPr>
+                            <w:r>
+                              <w:t xml:space="preserve">Figure </w:t>
+                            </w:r>
+                            <w:r>
+                              <w:fldChar w:fldCharType="begin"/>
+                            </w:r>
+                            <w:r>
+                              <w:instrText xml:space="preserve"> SEQ Figure \* ARABIC </w:instrText>
+                            </w:r>
+                            <w:r>
+                              <w:fldChar w:fldCharType="separate"/>
+                            </w:r>
+                            <w:r>
+                              <w:rPr>
+                                <w:noProof/>
+                              </w:rPr>
+                              <w:t>1</w:t>
+                            </w:r>
+                            <w:r>
+                              <w:fldChar w:fldCharType="end"/>
+                            </w:r>
+                            <w:r>
+                              <w:t>: Data Flow Diagram</w:t>
+                            </w:r>
+                          </w:p>
+                        </w:txbxContent>
+                      </wps:txbx>
+                      <wps:bodyPr rot="0" spcFirstLastPara="0" vertOverflow="overflow" horzOverflow="overflow" vert="horz" wrap="square" lIns="0" tIns="0" rIns="0" bIns="0" numCol="1" spcCol="0" rtlCol="0" fromWordArt="0" anchor="t" anchorCtr="0" forceAA="0" compatLnSpc="1">
+                        <a:prstTxWarp prst="textNoShape">
+                          <a:avLst/>
+                        </a:prstTxWarp>
+                        <a:spAutoFit/>
+                      </wps:bodyPr>
+                    </wps:wsp>
+                  </a:graphicData>
+                </a:graphic>
+              </wp:anchor>
+            </w:drawing>
+          </mc:Choice>
+          <mc:Fallback>
+            <w:pict>
+              <v:shapetype w14:anchorId="06733E0C" id="_x0000_t202" coordsize="21600,21600" o:spt="202" path="m,l,21600r21600,l21600,xe">
+                <v:stroke joinstyle="miter"/>
+                <v:path gradientshapeok="t" o:connecttype="rect"/>
+              </v:shapetype>
+              <v:shape id="Textfeld 1" o:spid="_x0000_s1026" type="#_x0000_t202" style="position:absolute;left:0;text-align:left;margin-left:99.7pt;margin-top:356.3pt;width:254.1pt;height:.05pt;z-index:251676672;visibility:visible;mso-wrap-style:square;mso-wrap-distance-left:9pt;mso-wrap-distance-top:0;mso-wrap-distance-right:9pt;mso-wrap-distance-bottom:0;mso-position-horizontal:absolute;mso-position-horizontal-relative:text;mso-position-vertical:absolute;mso-position-vertical-relative:text;v-text-anchor:top" o:gfxdata="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" stroked="f">
+                <v:textbox style="mso-fit-shape-to-text:t" inset="0,0,0,0">
+                  <w:txbxContent>
+                    <w:p>
+                      <w:pPr>
+                        <w:pStyle w:val="Beschriftung"/>
+                        <w:jc w:val="center"/>
+                        <w:rPr>
+                          <w:noProof/>
+                          <w:sz w:val="22"/>
+                          <w:lang w:val="en-US"/>
+                        </w:rPr>
+                      </w:pPr>
+                      <w:r>
+                        <w:t xml:space="preserve">Figure </w:t>
+                      </w:r>
+                      <w:r>
+                        <w:fldChar w:fldCharType="begin"/>
+                      </w:r>
+                      <w:r>
+                        <w:instrText xml:space="preserve"> SEQ Figure \* ARABIC </w:instrText>
+                      </w:r>
+                      <w:r>
+                        <w:fldChar w:fldCharType="separate"/>
+                      </w:r>
+                      <w:r>
+                        <w:rPr>
+                          <w:noProof/>
+                        </w:rPr>
+                        <w:t>1</w:t>
+                      </w:r>
+                      <w:r>
+                        <w:fldChar w:fldCharType="end"/>
+                      </w:r>
+                      <w:r>
+                        <w:t>: Data Flow Diagram</w:t>
+                      </w:r>
+                    </w:p>
+                  </w:txbxContent>
+                </v:textbox>
+                <w10:wrap type="topAndBottom"/>
+              </v:shape>
+            </w:pict>
+          </mc:Fallback>
+        </mc:AlternateContent>
+      </w:r>
+      <w:r>
+        <w:rPr>
+          <w:noProof/>
+          <w:lang w:val="en-US"/>
+        </w:rPr>
+        <w:drawing>
+          <wp:anchor distT="0" distB="0" distL="114300" distR="114300" simplePos="0" relativeHeight="251675648" behindDoc="0" locked="0" layoutInCell="1" allowOverlap="1" wp14:anchorId="7F1C426F" wp14:editId="7A2D9EB2">
+            <wp:simplePos x="0" y="0"/>
+            <wp:positionH relativeFrom="margin">
+              <wp:align>center</wp:align>
+            </wp:positionH>
+            <wp:positionV relativeFrom="paragraph">
+              <wp:posOffset>2136775</wp:posOffset>
+            </wp:positionV>
+            <wp:extent cx="3227700" cy="2578100"/>
+            <wp:effectExtent l="0" t="0" r="0" b="0"/>
+            <wp:wrapTopAndBottom/>
+            <wp:docPr id="1860544080" name="Grafik 2" descr="Ein Bild, das Diagramm, Screenshot, Design enthält.&#10;&#10;KI-generierte Inhalte können fehlerhaft sein."/>
+            <wp:cNvGraphicFramePr>
+              <a:graphicFrameLocks xmlns:a="http://schemas.openxmlformats.org/drawingml/2006/main" noChangeAspect="1"/>
+            </wp:cNvGraphicFramePr>
+            <a:graphic xmlns:a="http://schemas.openxmlformats.org/drawingml/2006/main">
+              <a:graphicData uri="http://schemas.openxmlformats.org/drawingml/2006/picture">
+                <pic:pic xmlns:pic="http://schemas.openxmlformats.org/drawingml/2006/picture">
+                  <pic:nvPicPr>
+                    <pic:cNvPr id="1860544080" name="Grafik 2" descr="Ein Bild, das Diagramm, Screenshot, Design enthält.&#10;&#10;KI-generierte Inhalte können fehlerhaft sein."/>
+                    <pic:cNvPicPr/>
+                  </pic:nvPicPr>
+                  <pic:blipFill rotWithShape="1">
+                    <a:blip r:embed="rId12">
+                      <a:extLst>
+                        <a:ext uri="{28A0092B-C50C-407E-A947-70E740481C1C}">
+                          <a14:useLocalDpi xmlns:a14="http://schemas.microsoft.com/office/drawing/2010/main" val="0"/>
+                        </a:ext>
+                      </a:extLst>
+                    </a:blip>
+                    <a:srcRect l="32305" t="25676" r="32635" b="24540"/>
+                    <a:stretch>
+                      <a:fillRect/>
+                    </a:stretch>
+                  </pic:blipFill>
+                  <pic:spPr bwMode="auto">
+                    <a:xfrm>
+                      <a:off x="0" y="0"/>
+                      <a:ext cx="3227700" cy="2578100"/>
+                    </a:xfrm>
+                    <a:prstGeom prst="rect">
+                      <a:avLst/>
+                    </a:prstGeom>
+                    <a:ln>
+                      <a:noFill/>
+                    </a:ln>
+                    <a:extLst>
+                      <a:ext uri="{53640926-AAD7-44D8-BBD7-CCE9431645EC}">
+                        <a14:shadowObscured xmlns:a14="http://schemas.microsoft.com/office/drawing/2010/main"/>
+                      </a:ext>
+                    </a:extLst>
+                  </pic:spPr>
+                </pic:pic>
+              </a:graphicData>
+            </a:graphic>
+          </wp:anchor>
+        </w:drawing>
+      </w:r>
+      <w:r>
+        <w:rPr>
+          <w:lang w:val="en-US"/>
+        </w:rPr>
+        <w:t>The final project includes three components, all which have to communicate with each other periodically. Firstly we have the right glove, which only has to send its sensor values to the left glove so they can be evaluated together. The right glove is a server and the left glove connects to it as a client via Bluetooth Low Energy (BLE). The left glove is responsible for evaluating the combined sensor time series data using a different AI model for form and repetition detection depending on the selected exercise. It serves both as a BLE client and server, as the mobile app is connected to it over BLE as a client. While the right glove sends both signals for the end of a rep and the evaluated label, the app only has to communicate whenever the user starts a new set of exercises, including the selected exercise, weight and repetitions.</w:t>
+      </w:r>
+    </w:p>
+    <w:p>
+      <w:pPr>
+        <w:pStyle w:val="berschrift2"/>
+        <w:rPr>
+          <w:i w:val="0"/>
+          <w:iCs w:val="0"/>
+          <w:lang w:val="en-US"/>
+        </w:rPr>
+      </w:pPr>
+      <w:r>
+        <w:rPr>
+          <w:i w:val="0"/>
+          <w:iCs w:val="0"/>
+          <w:lang w:val="en-US"/>
+        </w:rPr>
+        <w:lastRenderedPageBreak/>
+        <w:t>Hardware Design</w:t>
+      </w:r>
+      <w:r>
+        <w:rPr>
+          <w:i w:val="0"/>
+          <w:iCs w:val="0"/>
+          <w:lang w:val="en-US"/>
+        </w:rPr>
+        <w:t xml:space="preserve"> (Daniel)</w:t>
+      </w:r>
+    </w:p>
+    <w:p>
+      <w:pPr>
+        <w:rPr>
+          <w:lang w:val="en-US"/>
+        </w:rPr>
+      </w:pPr>
+      <w:r>
+        <w:rPr>
+          <w:lang w:val="en-US"/>
+        </w:rPr>
+        <w:t>The hardware design is a challenging problem, as training gloves require free movement and too much clutter would hinder the user in exercising. Thus, the best solution that minimizes the size of both the microcontroller’s and battery’s housing is modelling a mounting rail. The housings are connected to the counterpart of the rail’s shape, which makes it possible to slide them together without the need for any screws or clips. The mounting rail has small holes so it can be sewn to the glove.</w:t>
+      </w:r>
+    </w:p>
+    <w:p>
+      <w:pPr>
+        <w:rPr>
+          <w:lang w:val="en-GB"/>
+        </w:rPr>
+      </w:pPr>
+      <w:r>
+        <w:rPr>
+          <w:lang w:val="en-GB"/>
+        </w:rPr>
+        <w:t>For the battery, a smaller model with 250mAh is used on both gloves. To charge the microcontrollers, it can easily be connected to the battery pins of the Nicla Sense ME by connecting a plug directly leading to the battery and a socket on the microcontroller’s side. The battery will automatically be charged when the Nicla Sense ME is connected via micro-USB cable.</w:t>
+      </w:r>
+    </w:p>
+    <w:p>
+      <w:pPr>
+        <w:pStyle w:val="berschrift2"/>
+        <w:rPr>
+          <w:i w:val="0"/>
+          <w:iCs w:val="0"/>
+          <w:lang w:val="en-US"/>
+        </w:rPr>
+      </w:pPr>
+      <w:r>
+        <w:rPr>
+          <w:i w:val="0"/>
+          <w:iCs w:val="0"/>
+          <w:lang w:val="en-US"/>
+        </w:rPr>
+        <w:t>Smartphone App</w:t>
+      </w:r>
+      <w:r>
+        <w:rPr>
+          <w:i w:val="0"/>
+          <w:iCs w:val="0"/>
+          <w:lang w:val="en-US"/>
+        </w:rPr>
+        <w:t xml:space="preserve"> </w:t>
+      </w:r>
+    </w:p>
+    <w:p>
+      <w:pPr>
+        <w:rPr>
+          <w:lang w:val="en-US"/>
+        </w:rPr>
+      </w:pPr>
+      <w:r>
+        <w:rPr>
+          <w:lang w:val="en-US"/>
+        </w:rPr>
+        <w:t xml:space="preserve">Lorem ipsum dolor sit amet, consectetur adipiscing elit. </w:t>
+      </w:r>
+      <w:r>
+        <w:t xml:space="preserve">Aenean viverra eget sapien in fringilla. </w:t>
+      </w:r>
+      <w:r>
+        <w:rPr>
+          <w:lang w:val="en-US"/>
+        </w:rPr>
+        <w:t>Proin ac neque non lectus vehicula laoreet in cursus enim. Donec et erat ut erat commodo viverra vitae sed risus. Etiam tortor justo, placerat in turpis sit amet, egestas tristique libero. Phasellus metus arcu, viverra at interdum ac, convallis non urna. Sed nunc libero, elementum quis ultricies at, vestibulum in arcu. Nam ultrices felis ut sagittis hendrerit. Vivamus massa sapien, interdum nec dui ac, consectetur venenatis dolor. Integer enim felis, finibus at efficitur eget, viverra vitae purus. Curabitur at libero pretium, vestibulum lacus at, eleifend nisl.</w:t>
+      </w:r>
     </w:p>
     <w:p>
       <w:pPr>
@@ -6140,187 +7236,1212 @@
         <w:rPr>
           <w:lang w:val="en-US"/>
         </w:rPr>
+        <w:t xml:space="preserve">Ut consectetur ipsum id nisl sodales varius. Pellentesque habitant morbi tristique senectus et netus et malesuada fames ac turpis egestas. Aliquam venenatis varius maximus. Aenean aliquet mi a magna tempor, et sagittis ligula tincidunt. Maecenas ornare non leo et dignissim. </w:t>
+      </w:r>
+      <w:r>
+        <w:rPr>
+          <w:lang w:val="en-US"/>
+        </w:rPr>
+        <w:lastRenderedPageBreak/>
+        <w:t>Nunc ac feugiat magna. Nulla at sollicitudin massa, nec sollicitudin libero. Nunc posuere dolor mauris, non congue neque lobortis eget. Vestibulum ex leo, ullamcorper quis malesuada in, maximus quis nisl. Morbi neque diam, dignissim non suscipit ac, molestie at sem. In hac habitasse platea dictumst. Curabitur dictum eros non ipsum luctus, a malesuada sapien iaculis. Nam mauris nisi, sodales et consectetur quis, varius eu lacus.</w:t>
+      </w:r>
+    </w:p>
+    <w:p>
+      <w:pPr>
+        <w:rPr>
+          <w:lang w:val="en-US"/>
+        </w:rPr>
+      </w:pPr>
+    </w:p>
+    <w:p>
+      <w:pPr>
+        <w:pStyle w:val="berschrift1"/>
+        <w:rPr>
+          <w:lang w:val="en-US"/>
+        </w:rPr>
+      </w:pPr>
+      <w:r>
+        <w:rPr>
+          <w:lang w:val="en-US"/>
+        </w:rPr>
+        <w:lastRenderedPageBreak/>
+        <w:t>Implementation</w:t>
+      </w:r>
+    </w:p>
+    <w:p>
+      <w:pPr>
+        <w:rPr>
+          <w:lang w:val="en-US"/>
+        </w:rPr>
+      </w:pPr>
+      <w:r>
+        <w:rPr>
+          <w:lang w:val="en-US"/>
+        </w:rPr>
+        <w:t xml:space="preserve">Lorem ipsum dolor sit amet, consectetur adipiscing elit. </w:t>
+      </w:r>
+      <w:r>
+        <w:t xml:space="preserve">Aenean viverra eget sapien in fringilla. </w:t>
+      </w:r>
+      <w:r>
+        <w:rPr>
+          <w:lang w:val="en-US"/>
+        </w:rPr>
+        <w:t>Proin ac neque non lectus vehicula laoreet in cursus enim. Donec et erat ut erat commodo viverra vitae sed risus. Etiam tortor justo, placerat in turpis sit amet, egestas tristique libero. Phasellus metus arcu, viverra at interdum ac, convallis non urna. Sed nunc libero, elementum quis ultricies at, vestibulum in arcu. Nam ultrices felis ut sagittis hendrerit. Vivamus massa sapien, interdum nec dui ac, consectetur venenatis dolor. Integer enim felis, finibus at efficitur eget, viverra vitae purus. Curabitur at libero pretium, vestibulum lacus at, eleifend nisl.</w:t>
+      </w:r>
+    </w:p>
+    <w:p>
+      <w:pPr>
+        <w:pStyle w:val="berschrift2"/>
+        <w:rPr>
+          <w:i w:val="0"/>
+          <w:iCs w:val="0"/>
+          <w:lang w:val="en-US"/>
+        </w:rPr>
+      </w:pPr>
+      <w:r>
+        <w:rPr>
+          <w:i w:val="0"/>
+          <w:iCs w:val="0"/>
+          <w:lang w:val="en-US"/>
+        </w:rPr>
+        <w:t>Glove Firmware Logic</w:t>
+      </w:r>
+      <w:r>
+        <w:rPr>
+          <w:i w:val="0"/>
+          <w:iCs w:val="0"/>
+          <w:lang w:val="en-US"/>
+        </w:rPr>
+        <w:t xml:space="preserve"> (Daniel)</w:t>
+      </w:r>
+    </w:p>
+    <w:p>
+      <w:pPr>
+        <w:rPr>
+          <w:lang w:val="en-US"/>
+        </w:rPr>
+      </w:pPr>
+      <w:r>
+        <w:rPr>
+          <w:lang w:val="en-US"/>
+        </w:rPr>
+        <w:t>The code for the microcontrollers is managed in PlatformIO using normal Arduino code. As multiple main files will be used depending on the current stage in development, every main has its own framework in the initialization file, which all have a similar structure that filters them by name:</w:t>
+      </w:r>
+    </w:p>
+    <w:p>
+      <w:pPr>
+        <w:spacing w:after="120" w:line="240" w:lineRule="auto"/>
+        <w:rPr>
+          <w:rFonts w:ascii="Consolas" w:hAnsi="Consolas"/>
+          <w:sz w:val="20"/>
+          <w:szCs w:val="20"/>
+          <w:lang w:val="en-GB"/>
+        </w:rPr>
+      </w:pPr>
+      <w:r>
+        <w:rPr>
+          <w:rFonts w:ascii="Consolas" w:hAnsi="Consolas"/>
+          <w:sz w:val="20"/>
+          <w:szCs w:val="20"/>
+          <w:lang w:val="en-GB"/>
+        </w:rPr>
+        <w:t>[env:leftGlove]</w:t>
+      </w:r>
+    </w:p>
+    <w:p>
+      <w:pPr>
+        <w:spacing w:after="120" w:line="240" w:lineRule="auto"/>
+        <w:rPr>
+          <w:rFonts w:ascii="Consolas" w:hAnsi="Consolas"/>
+          <w:sz w:val="20"/>
+          <w:szCs w:val="20"/>
+          <w:lang w:val="en-GB"/>
+        </w:rPr>
+      </w:pPr>
+      <w:r>
+        <w:rPr>
+          <w:rFonts w:ascii="Consolas" w:hAnsi="Consolas"/>
+          <w:sz w:val="20"/>
+          <w:szCs w:val="20"/>
+          <w:lang w:val="en-GB"/>
+        </w:rPr>
+        <w:t>platform = nordicnrf52</w:t>
+      </w:r>
+    </w:p>
+    <w:p>
+      <w:pPr>
+        <w:spacing w:after="120" w:line="240" w:lineRule="auto"/>
+        <w:rPr>
+          <w:rFonts w:ascii="Consolas" w:hAnsi="Consolas"/>
+          <w:sz w:val="20"/>
+          <w:szCs w:val="20"/>
+          <w:lang w:val="en-GB"/>
+        </w:rPr>
+      </w:pPr>
+      <w:r>
+        <w:rPr>
+          <w:rFonts w:ascii="Consolas" w:hAnsi="Consolas"/>
+          <w:sz w:val="20"/>
+          <w:szCs w:val="20"/>
+          <w:lang w:val="en-GB"/>
+        </w:rPr>
+        <w:t>board = nicla_sense_me</w:t>
+      </w:r>
+    </w:p>
+    <w:p>
+      <w:pPr>
+        <w:spacing w:after="120" w:line="240" w:lineRule="auto"/>
+        <w:rPr>
+          <w:rFonts w:ascii="Consolas" w:hAnsi="Consolas"/>
+          <w:sz w:val="20"/>
+          <w:szCs w:val="20"/>
+          <w:lang w:val="en-GB"/>
+        </w:rPr>
+      </w:pPr>
+      <w:r>
+        <w:rPr>
+          <w:rFonts w:ascii="Consolas" w:hAnsi="Consolas"/>
+          <w:sz w:val="20"/>
+          <w:szCs w:val="20"/>
+          <w:lang w:val="en-GB"/>
+        </w:rPr>
+        <w:t>framework = arduino</w:t>
+      </w:r>
+    </w:p>
+    <w:p>
+      <w:pPr>
+        <w:spacing w:after="120" w:line="240" w:lineRule="auto"/>
+        <w:rPr>
+          <w:rFonts w:ascii="Consolas" w:hAnsi="Consolas"/>
+          <w:sz w:val="20"/>
+          <w:szCs w:val="20"/>
+          <w:lang w:val="en-GB"/>
+        </w:rPr>
+      </w:pPr>
+      <w:r>
+        <w:rPr>
+          <w:rFonts w:ascii="Consolas" w:hAnsi="Consolas"/>
+          <w:sz w:val="20"/>
+          <w:szCs w:val="20"/>
+          <w:lang w:val="en-GB"/>
+        </w:rPr>
+        <w:t>build_src_filter = +&lt;*.h&gt; +&lt;main-${PIOENV}.cpp&gt;</w:t>
+      </w:r>
+    </w:p>
+    <w:p>
+      <w:pPr>
+        <w:spacing w:after="120" w:line="240" w:lineRule="auto"/>
+        <w:rPr>
+          <w:rFonts w:ascii="Consolas" w:hAnsi="Consolas"/>
+          <w:sz w:val="20"/>
+          <w:szCs w:val="20"/>
+          <w:lang w:val="en-GB"/>
+        </w:rPr>
+      </w:pPr>
+      <w:r>
+        <w:rPr>
+          <w:rFonts w:ascii="Consolas" w:hAnsi="Consolas"/>
+          <w:sz w:val="20"/>
+          <w:szCs w:val="20"/>
+          <w:lang w:val="en-GB"/>
+        </w:rPr>
+        <w:t>lib_ldf_mode = deep+</w:t>
+      </w:r>
+    </w:p>
+    <w:p>
+      <w:pPr>
+        <w:spacing w:after="120" w:line="240" w:lineRule="auto"/>
+        <w:rPr>
+          <w:rFonts w:ascii="Consolas" w:hAnsi="Consolas"/>
+          <w:sz w:val="20"/>
+          <w:szCs w:val="20"/>
+          <w:lang w:val="en-GB"/>
+        </w:rPr>
+      </w:pPr>
+      <w:r>
+        <w:rPr>
+          <w:rFonts w:ascii="Consolas" w:hAnsi="Consolas"/>
+          <w:sz w:val="20"/>
+          <w:szCs w:val="20"/>
+          <w:lang w:val="en-GB"/>
+        </w:rPr>
+        <w:t xml:space="preserve">lib_deps = </w:t>
+      </w:r>
+    </w:p>
+    <w:p>
+      <w:pPr>
+        <w:spacing w:after="120" w:line="240" w:lineRule="auto"/>
+        <w:rPr>
+          <w:rFonts w:ascii="Consolas" w:hAnsi="Consolas"/>
+          <w:sz w:val="20"/>
+          <w:szCs w:val="20"/>
+          <w:lang w:val="en-GB"/>
+        </w:rPr>
+      </w:pPr>
+      <w:r>
+        <w:rPr>
+          <w:rFonts w:ascii="Consolas" w:hAnsi="Consolas"/>
+          <w:sz w:val="20"/>
+          <w:szCs w:val="20"/>
+          <w:lang w:val="en-GB"/>
+        </w:rPr>
+        <w:t>    arduino-libraries/ArduinoBLE@^1.4.1</w:t>
+      </w:r>
+    </w:p>
+    <w:p>
+      <w:pPr>
+        <w:spacing w:after="120" w:line="240" w:lineRule="auto"/>
+        <w:rPr>
+          <w:rFonts w:ascii="Consolas" w:hAnsi="Consolas"/>
+          <w:sz w:val="20"/>
+          <w:szCs w:val="20"/>
+          <w:lang w:val="en-GB"/>
+        </w:rPr>
+      </w:pPr>
+      <w:r>
+        <w:rPr>
+          <w:rFonts w:ascii="Consolas" w:hAnsi="Consolas"/>
+          <w:sz w:val="20"/>
+          <w:szCs w:val="20"/>
+          <w:lang w:val="en-GB"/>
+        </w:rPr>
+        <w:t>    arduino-libraries/Arduino_BHY2@^1.0.8</w:t>
+      </w:r>
+    </w:p>
+    <w:p>
+      <w:pPr>
+        <w:spacing w:after="120" w:line="240" w:lineRule="auto"/>
+        <w:rPr>
+          <w:rFonts w:ascii="Consolas" w:hAnsi="Consolas"/>
+          <w:sz w:val="20"/>
+          <w:szCs w:val="20"/>
+          <w:lang w:val="en-GB"/>
+        </w:rPr>
+      </w:pPr>
+    </w:p>
+    <w:p>
+      <w:pPr>
+        <w:pStyle w:val="berschrift3"/>
+        <w:rPr>
+          <w:lang w:val="en-GB"/>
+        </w:rPr>
+      </w:pPr>
+      <w:r>
+        <w:rPr>
+          <w:lang w:val="en-GB"/>
+        </w:rPr>
+        <w:t>Fetch Data</w:t>
+      </w:r>
+    </w:p>
+    <w:p>
+      <w:pPr>
+        <w:rPr>
+          <w:lang w:val="en-GB"/>
+        </w:rPr>
+      </w:pPr>
+      <w:r>
+        <w:rPr>
+          <w:lang w:val="en-GB"/>
+        </w:rPr>
+        <w:t>Because repetitions can’t be detected until a full dataset is created, the original data has to be collected manually. The right glove has to advertise itself:</w:t>
+      </w:r>
+    </w:p>
+    <w:p>
+      <w:pPr>
+        <w:spacing w:after="120" w:line="240" w:lineRule="auto"/>
+        <w:rPr>
+          <w:rFonts w:ascii="Consolas" w:hAnsi="Consolas"/>
+          <w:sz w:val="20"/>
+          <w:szCs w:val="20"/>
+          <w:lang w:val="en-GB"/>
+        </w:rPr>
+      </w:pPr>
+      <w:r>
+        <w:rPr>
+          <w:rFonts w:ascii="Consolas" w:hAnsi="Consolas"/>
+          <w:sz w:val="20"/>
+          <w:szCs w:val="20"/>
+          <w:lang w:val="en-GB"/>
+        </w:rPr>
+        <w:t>BLE.begin();</w:t>
+      </w:r>
+    </w:p>
+    <w:p>
+      <w:pPr>
+        <w:spacing w:after="120" w:line="240" w:lineRule="auto"/>
+        <w:rPr>
+          <w:rFonts w:ascii="Consolas" w:hAnsi="Consolas"/>
+          <w:sz w:val="20"/>
+          <w:szCs w:val="20"/>
+          <w:lang w:val="en-GB"/>
+        </w:rPr>
+      </w:pPr>
+      <w:r>
+        <w:rPr>
+          <w:rFonts w:ascii="Consolas" w:hAnsi="Consolas"/>
+          <w:sz w:val="20"/>
+          <w:szCs w:val="20"/>
+          <w:lang w:val="en-GB"/>
+        </w:rPr>
+        <w:t>  BLE.setLocalName("RightGlove");</w:t>
+      </w:r>
+    </w:p>
+    <w:p>
+      <w:pPr>
+        <w:spacing w:after="120" w:line="240" w:lineRule="auto"/>
+        <w:rPr>
+          <w:rFonts w:ascii="Consolas" w:hAnsi="Consolas"/>
+          <w:sz w:val="20"/>
+          <w:szCs w:val="20"/>
+          <w:lang w:val="en-GB"/>
+        </w:rPr>
+      </w:pPr>
+      <w:r>
+        <w:rPr>
+          <w:rFonts w:ascii="Consolas" w:hAnsi="Consolas"/>
+          <w:sz w:val="20"/>
+          <w:szCs w:val="20"/>
+          <w:lang w:val="en-GB"/>
+        </w:rPr>
+        <w:lastRenderedPageBreak/>
+        <w:t>  BLE.setAdvertisedService(sensorValues);</w:t>
+      </w:r>
+    </w:p>
+    <w:p>
+      <w:pPr>
+        <w:spacing w:after="120" w:line="240" w:lineRule="auto"/>
+        <w:rPr>
+          <w:rFonts w:ascii="Consolas" w:hAnsi="Consolas"/>
+          <w:sz w:val="20"/>
+          <w:szCs w:val="20"/>
+          <w:lang w:val="en-GB"/>
+        </w:rPr>
+      </w:pPr>
+      <w:r>
+        <w:rPr>
+          <w:rFonts w:ascii="Consolas" w:hAnsi="Consolas"/>
+          <w:sz w:val="20"/>
+          <w:szCs w:val="20"/>
+          <w:lang w:val="en-GB"/>
+        </w:rPr>
+        <w:t>  sensorValues.addCharacteristic(movementChar);</w:t>
+      </w:r>
+    </w:p>
+    <w:p>
+      <w:pPr>
+        <w:spacing w:after="120" w:line="240" w:lineRule="auto"/>
+        <w:rPr>
+          <w:rFonts w:ascii="Consolas" w:hAnsi="Consolas"/>
+          <w:sz w:val="20"/>
+          <w:szCs w:val="20"/>
+          <w:lang w:val="en-GB"/>
+        </w:rPr>
+      </w:pPr>
+      <w:r>
+        <w:rPr>
+          <w:rFonts w:ascii="Consolas" w:hAnsi="Consolas"/>
+          <w:sz w:val="20"/>
+          <w:szCs w:val="20"/>
+          <w:lang w:val="en-GB"/>
+        </w:rPr>
+        <w:t>  BLE.addService(sensorValues);</w:t>
+      </w:r>
+    </w:p>
+    <w:p>
+      <w:pPr>
+        <w:spacing w:after="120" w:line="240" w:lineRule="auto"/>
+        <w:rPr>
+          <w:rFonts w:ascii="Consolas" w:hAnsi="Consolas"/>
+          <w:sz w:val="20"/>
+          <w:szCs w:val="20"/>
+          <w:lang w:val="en-GB"/>
+        </w:rPr>
+      </w:pPr>
+      <w:r>
+        <w:rPr>
+          <w:rFonts w:ascii="Consolas" w:hAnsi="Consolas"/>
+          <w:sz w:val="20"/>
+          <w:szCs w:val="20"/>
+          <w:lang w:val="en-GB"/>
+        </w:rPr>
+        <w:t>  BLE.advertise();</w:t>
+      </w:r>
+    </w:p>
+    <w:p>
+      <w:pPr>
+        <w:spacing w:after="120" w:line="240" w:lineRule="auto"/>
+        <w:rPr>
+          <w:rFonts w:ascii="Consolas" w:hAnsi="Consolas"/>
+          <w:sz w:val="20"/>
+          <w:szCs w:val="20"/>
+          <w:lang w:val="en-GB"/>
+        </w:rPr>
+      </w:pPr>
+    </w:p>
+    <w:p>
+      <w:pPr>
+        <w:rPr>
+          <w:lang w:val="en-GB"/>
+        </w:rPr>
+      </w:pPr>
+      <w:r>
+        <w:rPr>
+          <w:lang w:val="en-GB"/>
+        </w:rPr>
+        <w:t>The sensor data also has to be collected periodically and written on the characteristic so the left Glove can access it. The easiest way to do it is to copy the values into the buffer memory:</w:t>
+      </w:r>
+    </w:p>
+    <w:p>
+      <w:pPr>
+        <w:spacing w:after="120" w:line="240" w:lineRule="auto"/>
+        <w:rPr>
+          <w:rFonts w:ascii="Consolas" w:hAnsi="Consolas"/>
+          <w:sz w:val="20"/>
+          <w:szCs w:val="20"/>
+          <w:lang w:val="en-GB"/>
+        </w:rPr>
+      </w:pPr>
+      <w:r>
+        <w:rPr>
+          <w:rFonts w:ascii="Consolas" w:hAnsi="Consolas"/>
+          <w:sz w:val="20"/>
+          <w:szCs w:val="20"/>
+          <w:lang w:val="en-GB"/>
+        </w:rPr>
+        <w:t>void sendSensorData(){</w:t>
+      </w:r>
+    </w:p>
+    <w:p>
+      <w:pPr>
+        <w:spacing w:after="120" w:line="240" w:lineRule="auto"/>
+        <w:rPr>
+          <w:rFonts w:ascii="Consolas" w:hAnsi="Consolas"/>
+          <w:sz w:val="20"/>
+          <w:szCs w:val="20"/>
+          <w:lang w:val="en-GB"/>
+        </w:rPr>
+      </w:pPr>
+      <w:r>
+        <w:rPr>
+          <w:rFonts w:ascii="Consolas" w:hAnsi="Consolas"/>
+          <w:sz w:val="20"/>
+          <w:szCs w:val="20"/>
+          <w:lang w:val="en-GB"/>
+        </w:rPr>
+        <w:t>  float ax = accel.x(), ay = accel.y(), az = accel.z();  </w:t>
+      </w:r>
+    </w:p>
+    <w:p>
+      <w:pPr>
+        <w:spacing w:after="120" w:line="240" w:lineRule="auto"/>
+        <w:rPr>
+          <w:rFonts w:ascii="Consolas" w:hAnsi="Consolas"/>
+          <w:sz w:val="20"/>
+          <w:szCs w:val="20"/>
+          <w:lang w:val="en-GB"/>
+        </w:rPr>
+      </w:pPr>
+      <w:r>
+        <w:rPr>
+          <w:rFonts w:ascii="Consolas" w:hAnsi="Consolas"/>
+          <w:sz w:val="20"/>
+          <w:szCs w:val="20"/>
+          <w:lang w:val="en-GB"/>
+        </w:rPr>
+        <w:t>  float gx = gyro.x(), gy = gyro.y(), gz = gyro.z();</w:t>
+      </w:r>
+    </w:p>
+    <w:p>
+      <w:pPr>
+        <w:spacing w:after="120" w:line="240" w:lineRule="auto"/>
+        <w:rPr>
+          <w:rFonts w:ascii="Consolas" w:hAnsi="Consolas"/>
+          <w:sz w:val="20"/>
+          <w:szCs w:val="20"/>
+          <w:lang w:val="en-GB"/>
+        </w:rPr>
+      </w:pPr>
+    </w:p>
+    <w:p>
+      <w:pPr>
+        <w:spacing w:after="120" w:line="240" w:lineRule="auto"/>
+        <w:rPr>
+          <w:rFonts w:ascii="Consolas" w:hAnsi="Consolas"/>
+          <w:sz w:val="20"/>
+          <w:szCs w:val="20"/>
+          <w:lang w:val="en-GB"/>
+        </w:rPr>
+      </w:pPr>
+      <w:r>
+        <w:rPr>
+          <w:rFonts w:ascii="Consolas" w:hAnsi="Consolas"/>
+          <w:sz w:val="20"/>
+          <w:szCs w:val="20"/>
+          <w:lang w:val="en-GB"/>
+        </w:rPr>
+        <w:t>  byte buffer[24];</w:t>
+      </w:r>
+    </w:p>
+    <w:p>
+      <w:pPr>
+        <w:spacing w:after="120" w:line="240" w:lineRule="auto"/>
+        <w:rPr>
+          <w:rFonts w:ascii="Consolas" w:hAnsi="Consolas"/>
+          <w:sz w:val="20"/>
+          <w:szCs w:val="20"/>
+          <w:lang w:val="en-GB"/>
+        </w:rPr>
+      </w:pPr>
+      <w:r>
+        <w:rPr>
+          <w:rFonts w:ascii="Consolas" w:hAnsi="Consolas"/>
+          <w:sz w:val="20"/>
+          <w:szCs w:val="20"/>
+          <w:lang w:val="en-GB"/>
+        </w:rPr>
+        <w:t>  memcpy(&amp;buffer[0], &amp;ax, 4);</w:t>
+      </w:r>
+    </w:p>
+    <w:p>
+      <w:pPr>
+        <w:spacing w:after="120" w:line="240" w:lineRule="auto"/>
+        <w:rPr>
+          <w:rFonts w:ascii="Consolas" w:hAnsi="Consolas"/>
+          <w:sz w:val="20"/>
+          <w:szCs w:val="20"/>
+          <w:lang w:val="en-GB"/>
+        </w:rPr>
+      </w:pPr>
+      <w:r>
+        <w:rPr>
+          <w:rFonts w:ascii="Consolas" w:hAnsi="Consolas"/>
+          <w:sz w:val="20"/>
+          <w:szCs w:val="20"/>
+          <w:lang w:val="en-GB"/>
+        </w:rPr>
+        <w:t>  memcpy(&amp;buffer[4], &amp;ay, 4);</w:t>
+      </w:r>
+    </w:p>
+    <w:p>
+      <w:pPr>
+        <w:spacing w:after="120" w:line="240" w:lineRule="auto"/>
+        <w:rPr>
+          <w:rFonts w:ascii="Consolas" w:hAnsi="Consolas"/>
+          <w:sz w:val="20"/>
+          <w:szCs w:val="20"/>
+          <w:lang w:val="en-GB"/>
+        </w:rPr>
+      </w:pPr>
+      <w:r>
+        <w:rPr>
+          <w:rFonts w:ascii="Consolas" w:hAnsi="Consolas"/>
+          <w:sz w:val="20"/>
+          <w:szCs w:val="20"/>
+          <w:lang w:val="en-GB"/>
+        </w:rPr>
+        <w:t>  memcpy(&amp;buffer[8], &amp;az, 4);</w:t>
+      </w:r>
+    </w:p>
+    <w:p>
+      <w:pPr>
+        <w:spacing w:after="120" w:line="240" w:lineRule="auto"/>
+        <w:rPr>
+          <w:rFonts w:ascii="Consolas" w:hAnsi="Consolas"/>
+          <w:sz w:val="20"/>
+          <w:szCs w:val="20"/>
+          <w:lang w:val="en-GB"/>
+        </w:rPr>
+      </w:pPr>
+      <w:r>
+        <w:rPr>
+          <w:rFonts w:ascii="Consolas" w:hAnsi="Consolas"/>
+          <w:sz w:val="20"/>
+          <w:szCs w:val="20"/>
+          <w:lang w:val="en-GB"/>
+        </w:rPr>
+        <w:t>  memcpy(&amp;buffer[12], &amp;gx, 4);</w:t>
+      </w:r>
+    </w:p>
+    <w:p>
+      <w:pPr>
+        <w:spacing w:after="120" w:line="240" w:lineRule="auto"/>
+        <w:rPr>
+          <w:rFonts w:ascii="Consolas" w:hAnsi="Consolas"/>
+          <w:sz w:val="20"/>
+          <w:szCs w:val="20"/>
+          <w:lang w:val="en-GB"/>
+        </w:rPr>
+      </w:pPr>
+      <w:r>
+        <w:rPr>
+          <w:rFonts w:ascii="Consolas" w:hAnsi="Consolas"/>
+          <w:sz w:val="20"/>
+          <w:szCs w:val="20"/>
+          <w:lang w:val="en-GB"/>
+        </w:rPr>
+        <w:t>  memcpy(&amp;buffer[16], &amp;gy, 4);</w:t>
+      </w:r>
+    </w:p>
+    <w:p>
+      <w:pPr>
+        <w:spacing w:after="120" w:line="240" w:lineRule="auto"/>
+        <w:rPr>
+          <w:rFonts w:ascii="Consolas" w:hAnsi="Consolas"/>
+          <w:sz w:val="20"/>
+          <w:szCs w:val="20"/>
+          <w:lang w:val="en-GB"/>
+        </w:rPr>
+      </w:pPr>
+      <w:r>
+        <w:rPr>
+          <w:rFonts w:ascii="Consolas" w:hAnsi="Consolas"/>
+          <w:sz w:val="20"/>
+          <w:szCs w:val="20"/>
+          <w:lang w:val="en-GB"/>
+        </w:rPr>
+        <w:t>  memcpy(&amp;buffer[20], &amp;gz, 4);</w:t>
+      </w:r>
+    </w:p>
+    <w:p>
+      <w:pPr>
+        <w:spacing w:after="120" w:line="240" w:lineRule="auto"/>
+        <w:rPr>
+          <w:rFonts w:ascii="Consolas" w:hAnsi="Consolas"/>
+          <w:sz w:val="20"/>
+          <w:szCs w:val="20"/>
+          <w:lang w:val="en-GB"/>
+        </w:rPr>
+      </w:pPr>
+    </w:p>
+    <w:p>
+      <w:pPr>
+        <w:spacing w:after="120" w:line="240" w:lineRule="auto"/>
+        <w:rPr>
+          <w:rFonts w:ascii="Consolas" w:hAnsi="Consolas"/>
+          <w:sz w:val="20"/>
+          <w:szCs w:val="20"/>
+          <w:lang w:val="en-GB"/>
+        </w:rPr>
+      </w:pPr>
+      <w:r>
+        <w:rPr>
+          <w:rFonts w:ascii="Consolas" w:hAnsi="Consolas"/>
+          <w:sz w:val="20"/>
+          <w:szCs w:val="20"/>
+          <w:lang w:val="en-GB"/>
+        </w:rPr>
+        <w:t>  movementChar.writeValue(buffer, 24, true);</w:t>
+      </w:r>
+    </w:p>
+    <w:p>
+      <w:pPr>
+        <w:spacing w:after="120" w:line="240" w:lineRule="auto"/>
+        <w:rPr>
+          <w:rFonts w:ascii="Consolas" w:hAnsi="Consolas"/>
+          <w:sz w:val="20"/>
+          <w:szCs w:val="20"/>
+          <w:lang w:val="en-GB"/>
+        </w:rPr>
+      </w:pPr>
+      <w:r>
+        <w:rPr>
+          <w:rFonts w:ascii="Consolas" w:hAnsi="Consolas"/>
+          <w:sz w:val="20"/>
+          <w:szCs w:val="20"/>
+          <w:lang w:val="en-GB"/>
+        </w:rPr>
+        <w:t>}</w:t>
+      </w:r>
+    </w:p>
+    <w:p>
+      <w:pPr>
+        <w:spacing w:after="120" w:line="240" w:lineRule="auto"/>
+        <w:rPr>
+          <w:rFonts w:ascii="Consolas" w:hAnsi="Consolas"/>
+          <w:sz w:val="20"/>
+          <w:szCs w:val="20"/>
+          <w:lang w:val="en-GB"/>
+        </w:rPr>
+      </w:pPr>
+    </w:p>
+    <w:p>
+      <w:pPr>
+        <w:rPr>
+          <w:lang w:val="en-GB"/>
+        </w:rPr>
+      </w:pPr>
+      <w:r>
+        <w:rPr>
+          <w:lang w:val="en-GB"/>
+        </w:rPr>
+        <w:t>In the code of t</w:t>
+      </w:r>
+      <w:r>
+        <w:rPr>
+          <w:lang w:val="en-GB"/>
+        </w:rPr>
+        <w:t>he left glove, the connection to the right glove is handled by searching for the device by name:</w:t>
+      </w:r>
+    </w:p>
+    <w:p>
+      <w:pPr>
+        <w:pStyle w:val="Code"/>
+      </w:pPr>
+      <w:r>
+        <w:t>void scanForRightHand(){</w:t>
+      </w:r>
+    </w:p>
+    <w:p>
+      <w:pPr>
+        <w:pStyle w:val="Code"/>
+      </w:pPr>
+      <w:r>
+        <w:t>  Serial.println("Scanning for RightGlove...");</w:t>
+      </w:r>
+    </w:p>
+    <w:p>
+      <w:pPr>
+        <w:pStyle w:val="Code"/>
+      </w:pPr>
+      <w:r>
+        <w:t>  while(true){</w:t>
+      </w:r>
+    </w:p>
+    <w:p>
+      <w:pPr>
+        <w:pStyle w:val="Code"/>
+      </w:pPr>
+      <w:r>
+        <w:t>    peripheral = BLE.available();</w:t>
+      </w:r>
+    </w:p>
+    <w:p>
+      <w:pPr>
+        <w:pStyle w:val="Code"/>
+      </w:pPr>
+      <w:r>
+        <w:t>    if(peripheral) {</w:t>
+      </w:r>
+    </w:p>
+    <w:p>
+      <w:pPr>
+        <w:pStyle w:val="Code"/>
+      </w:pPr>
+      <w:r>
+        <w:t>      if (peripheral.localName() == "RightGlove") {</w:t>
+      </w:r>
+    </w:p>
+    <w:p>
+      <w:pPr>
+        <w:pStyle w:val="Code"/>
+      </w:pPr>
+      <w:r>
+        <w:t>        Serial.println("RightGlove found!");</w:t>
+      </w:r>
+    </w:p>
+    <w:p>
+      <w:pPr>
+        <w:pStyle w:val="Code"/>
+      </w:pPr>
+      <w:r>
+        <w:t>        BLE.stopScan();</w:t>
+      </w:r>
+    </w:p>
+    <w:p>
+      <w:pPr>
+        <w:pStyle w:val="Code"/>
+      </w:pPr>
+      <w:r>
+        <w:t>        break;</w:t>
+      </w:r>
+    </w:p>
+    <w:p>
+      <w:pPr>
+        <w:pStyle w:val="Code"/>
+      </w:pPr>
+      <w:r>
+        <w:lastRenderedPageBreak/>
+        <w:t>      }</w:t>
+      </w:r>
+    </w:p>
+    <w:p>
+      <w:pPr>
+        <w:pStyle w:val="Code"/>
+      </w:pPr>
+    </w:p>
+    <w:p>
+      <w:pPr>
+        <w:pStyle w:val="Code"/>
+      </w:pPr>
+      <w:r>
+        <w:t>    }</w:t>
+      </w:r>
+    </w:p>
+    <w:p>
+      <w:pPr>
+        <w:pStyle w:val="Code"/>
+      </w:pPr>
+      <w:r>
+        <w:t>    delay(10);</w:t>
+      </w:r>
+    </w:p>
+    <w:p>
+      <w:pPr>
+        <w:pStyle w:val="Code"/>
+      </w:pPr>
+      <w:r>
+        <w:t>  }</w:t>
+      </w:r>
+    </w:p>
+    <w:p>
+      <w:pPr>
+        <w:pStyle w:val="Code"/>
+      </w:pPr>
+      <w:r>
+        <w:t>}</w:t>
+      </w:r>
+    </w:p>
+    <w:p>
+      <w:pPr>
+        <w:pStyle w:val="Code"/>
+      </w:pPr>
+    </w:p>
+    <w:p>
+      <w:pPr>
+        <w:rPr>
+          <w:lang w:val="en-GB"/>
+        </w:rPr>
+      </w:pPr>
+      <w:r>
+        <w:rPr>
+          <w:lang w:val="en-GB"/>
+        </w:rPr>
+        <w:t>The own sensor data c</w:t>
+      </w:r>
+      <w:r>
+        <w:rPr>
+          <w:lang w:val="en-GB"/>
+        </w:rPr>
+        <w:t>an easily be collected just by reading it, and the data from the right glove can simply be read from the characteristic. To safe the data into tables, there is also a function to send the whole data to the Serial Monitor:</w:t>
+      </w:r>
+    </w:p>
+    <w:p>
+      <w:pPr>
+        <w:pStyle w:val="Code"/>
+      </w:pPr>
+      <w:r>
+        <w:t>void sendToPC(float* leftValues, float* rightValues) {</w:t>
+      </w:r>
+    </w:p>
+    <w:p>
+      <w:pPr>
+        <w:pStyle w:val="Code"/>
+      </w:pPr>
+      <w:r>
+        <w:t>  if (!leftValues || !rightValues) return;</w:t>
+      </w:r>
+    </w:p>
+    <w:p>
+      <w:pPr>
+        <w:pStyle w:val="Code"/>
+      </w:pPr>
+      <w:r>
+        <w:t>  for (int i = 0; i &lt; 6; i++) {</w:t>
+      </w:r>
+    </w:p>
+    <w:p>
+      <w:pPr>
+        <w:pStyle w:val="Code"/>
+      </w:pPr>
+      <w:r>
+        <w:t>    Serial.print(leftValues[i], 2);</w:t>
+      </w:r>
+    </w:p>
+    <w:p>
+      <w:pPr>
+        <w:pStyle w:val="Code"/>
+      </w:pPr>
+      <w:r>
+        <w:t>    Serial.print(",");</w:t>
+      </w:r>
+    </w:p>
+    <w:p>
+      <w:pPr>
+        <w:pStyle w:val="Code"/>
+      </w:pPr>
+      <w:r>
+        <w:t>  }</w:t>
+      </w:r>
+    </w:p>
+    <w:p>
+      <w:pPr>
+        <w:pStyle w:val="Code"/>
+      </w:pPr>
+      <w:r>
+        <w:t>  for (int i = 0; i &lt; 5; i++) {</w:t>
+      </w:r>
+    </w:p>
+    <w:p>
+      <w:pPr>
+        <w:pStyle w:val="Code"/>
+      </w:pPr>
+      <w:r>
+        <w:t>    Serial.print(rightValues[i], 2);</w:t>
+      </w:r>
+    </w:p>
+    <w:p>
+      <w:pPr>
+        <w:pStyle w:val="Code"/>
+      </w:pPr>
+      <w:r>
+        <w:t>    Serial.print(",");</w:t>
+      </w:r>
+    </w:p>
+    <w:p>
+      <w:pPr>
+        <w:pStyle w:val="Code"/>
+      </w:pPr>
+      <w:r>
+        <w:t>  }</w:t>
+      </w:r>
+    </w:p>
+    <w:p>
+      <w:pPr>
+        <w:pStyle w:val="Code"/>
+      </w:pPr>
+      <w:r>
+        <w:t>  Serial.println(rightValues[5], 2);</w:t>
+      </w:r>
+    </w:p>
+    <w:p>
+      <w:pPr>
+        <w:pStyle w:val="Code"/>
+        <w:rPr>
+          <w:lang w:val="de-AT"/>
+        </w:rPr>
+      </w:pPr>
+      <w:r>
+        <w:rPr>
+          <w:lang w:val="de-AT"/>
+        </w:rPr>
+        <w:t>}</w:t>
+      </w:r>
+    </w:p>
+    <w:p>
+      <w:pPr>
+        <w:pStyle w:val="Code"/>
+        <w:rPr>
+          <w:lang w:val="de-AT"/>
+        </w:rPr>
+      </w:pPr>
+    </w:p>
+    <w:p>
+      <w:pPr>
+        <w:pStyle w:val="berschrift3"/>
+        <w:rPr>
+          <w:lang w:val="de-AT"/>
+        </w:rPr>
+      </w:pPr>
+      <w:r>
+        <w:rPr>
+          <w:lang w:val="de-AT"/>
+        </w:rPr>
+        <w:t>App Test</w:t>
+      </w:r>
+    </w:p>
+    <w:p>
+      <w:pPr>
+        <w:spacing w:after="120" w:line="240" w:lineRule="auto"/>
+        <w:rPr>
+          <w:rFonts w:ascii="Consolas" w:hAnsi="Consolas"/>
+          <w:sz w:val="20"/>
+          <w:szCs w:val="20"/>
+          <w:lang w:val="en-GB"/>
+        </w:rPr>
+      </w:pPr>
+    </w:p>
+    <w:p>
+      <w:pPr>
+        <w:rPr>
+          <w:lang w:val="en-GB"/>
+        </w:rPr>
+      </w:pPr>
+    </w:p>
+    <w:p>
+      <w:pPr>
+        <w:pStyle w:val="berschrift2"/>
+        <w:rPr>
+          <w:i w:val="0"/>
+          <w:iCs w:val="0"/>
+          <w:lang w:val="en-US"/>
+        </w:rPr>
+      </w:pPr>
+      <w:r>
+        <w:rPr>
+          <w:i w:val="0"/>
+          <w:iCs w:val="0"/>
+          <w:lang w:val="en-US"/>
+        </w:rPr>
+        <w:t>3D Print</w:t>
+      </w:r>
+    </w:p>
+    <w:p>
+      <w:pPr>
+        <w:rPr>
+          <w:lang w:val="en-US"/>
+        </w:rPr>
+      </w:pPr>
+      <w:r>
+        <w:rPr>
+          <w:lang w:val="en-US"/>
+        </w:rPr>
+        <w:t xml:space="preserve">Ut consectetur ipsum id nisl sodales varius. Pellentesque habitant morbi tristique senectus et netus et malesuada fames ac turpis egestas. Aliquam venenatis varius maximus. Aenean aliquet mi a magna tempor, et sagittis ligula tincidunt. Maecenas ornare non leo et dignissim. </w:t>
+      </w:r>
+      <w:r>
+        <w:rPr>
+          <w:lang w:val="en-US"/>
+        </w:rPr>
+        <w:lastRenderedPageBreak/>
+        <w:t>Nunc ac feugiat magna. Nulla at sollicitudin massa, nec sollicitudin libero. Nunc posuere dolor mauris, non congue neque lobortis eget. Vestibulum ex leo, ullamcorper quis malesuada in, maximus quis nisl. Morbi neque diam, dignissim non suscipit ac, molestie at sem. In hac habitasse platea dictumst. Curabitur dictum eros non ipsum luctus, a malesuada sapien iaculis. Nam mauris nisi, sodales et consectetur quis, varius eu lacus.</w:t>
+      </w:r>
+    </w:p>
+    <w:p>
+      <w:pPr>
+        <w:rPr>
+          <w:lang w:val="en-US"/>
+        </w:rPr>
+      </w:pPr>
+    </w:p>
+    <w:p>
+      <w:pPr>
+        <w:pStyle w:val="berschrift2"/>
+        <w:rPr>
+          <w:i w:val="0"/>
+          <w:iCs w:val="0"/>
+          <w:lang w:val="en-US"/>
+        </w:rPr>
+      </w:pPr>
+      <w:r>
+        <w:rPr>
+          <w:i w:val="0"/>
+          <w:iCs w:val="0"/>
+          <w:lang w:val="en-US"/>
+        </w:rPr>
+        <w:t>AI Model Training</w:t>
+      </w:r>
+    </w:p>
+    <w:p>
+      <w:pPr>
+        <w:rPr>
+          <w:lang w:val="en-US"/>
+        </w:rPr>
+      </w:pPr>
+      <w:r>
+        <w:rPr>
+          <w:lang w:val="en-US"/>
+        </w:rPr>
         <w:t>Ut consectetur ipsum id nisl sodales varius. Pellentesque habitant morbi tristique senectus et netus et malesuada fames ac turpis egestas. Aliquam venenatis varius maximus. Aenean aliquet mi a magna tempor, et sagittis ligula tincidunt. Maecenas ornare non leo et dignissim. Nunc ac feugiat magna. Nulla at sollicitudin massa, nec sollicitudin libero. Nunc posuere dolor mauris, non congue neque lobortis eget. Vestibulum ex leo, ullamcorper quis malesuada in, maximus quis nisl. Morbi neque diam, dignissim non suscipit ac, molestie at sem. In hac habitasse platea dictumst. Curabitur dictum eros non ipsum luctus, a malesuada sapien iaculis. Nam mauris nisi, sodales et consectetur quis, varius eu lacus.</w:t>
       </w:r>
     </w:p>
     <w:p>
       <w:pPr>
-        <w:pStyle w:val="berschrift3"/>
-      </w:pPr>
-      <w:bookmarkStart w:id="17" w:name="_Toc221128505"/>
-      <w:r>
-        <w:rPr>
-          <w:lang w:val="en-US"/>
-        </w:rPr>
-        <w:t>Content A1a</w:t>
-      </w:r>
-      <w:bookmarkEnd w:id="17"/>
-    </w:p>
-    <w:p>
-      <w:pPr>
-        <w:rPr>
-          <w:lang w:val="en-US"/>
-        </w:rPr>
-      </w:pPr>
-      <w:r>
-        <w:rPr>
-          <w:lang w:val="en-US"/>
-        </w:rPr>
-        <w:t xml:space="preserve">Ut consectetur ipsum id nisl sodales varius. Pellentesque habitant morbi tristique senectus et netus et malesuada fames ac turpis egestas. Aliquam venenatis varius maximus. Aenean aliquet mi a magna tempor, et sagittis ligula tincidunt. Maecenas ornare non leo et dignissim. Nunc ac feugiat magna. Nulla at sollicitudin massa, nec sollicitudin libero. Nunc posuere dolor </w:t>
-      </w:r>
-      <w:r>
-        <w:rPr>
+        <w:rPr>
+          <w:lang w:val="en-US"/>
+        </w:rPr>
+      </w:pPr>
+      <w:r>
+        <w:rPr>
+          <w:lang w:val="en-US"/>
+        </w:rPr>
+        <w:t>Ut consectetur ipsum id nisl sodales varius. Pellentesque habitant morbi tristique senectus et netus et malesuada fames ac turpis egestas. Aliquam venenatis varius maximus. Aenean aliquet mi a magna tempor, et sagittis ligula tincidunt. Maecenas ornare non leo et dignissim. Nunc ac feugiat magna. Nulla at sollicitudin massa, nec sollicitudin libero. Nunc posuere dolor mauris, non congue neque lobortis eget. Vestibulum ex leo, ullamcorper quis malesuada in, maximus quis nisl. Morbi neque diam, dignissim non suscipit ac, molestie at sem. In hac habitasse platea dictumst. Curabitur dictum eros non ipsum luctus, a malesuada sapien iaculis. Nam mauris nisi, sodales et consectetur quis, varius eu lacus.</w:t>
+      </w:r>
+    </w:p>
+    <w:p>
+      <w:pPr>
+        <w:rPr>
+          <w:lang w:val="en-US"/>
+        </w:rPr>
+      </w:pPr>
+    </w:p>
+    <w:p>
+      <w:pPr>
+        <w:rPr>
+          <w:lang w:val="en-US"/>
+        </w:rPr>
+      </w:pPr>
+    </w:p>
+    <w:p>
+      <w:pPr>
+        <w:rPr>
+          <w:lang w:val="en-US"/>
+        </w:rPr>
+      </w:pPr>
+    </w:p>
+    <w:p>
+      <w:pPr>
+        <w:pStyle w:val="berschrift2"/>
+        <w:rPr>
+          <w:i w:val="0"/>
+          <w:iCs w:val="0"/>
+          <w:lang w:val="en-US"/>
+        </w:rPr>
+      </w:pPr>
+      <w:r>
+        <w:rPr>
+          <w:i w:val="0"/>
+          <w:iCs w:val="0"/>
           <w:lang w:val="en-US"/>
         </w:rPr>
         <w:lastRenderedPageBreak/>
-        <w:t>mauris, non congue neque lobortis eget. Vestibulum ex leo, ullamcorper quis malesuada in, maximus quis nisl. Morbi neque diam, dignissim non suscipit ac, molestie at sem. In hac habitasse platea dictumst. Curabitur dictum eros non ipsum luctus, a malesuada sapien iaculis. Nam mauris nisi, sodales et consectetur quis, varius eu lacus.</w:t>
-      </w:r>
-    </w:p>
-    <w:p>
-      <w:pPr>
-        <w:pStyle w:val="berschrift3"/>
-        <w:rPr>
-          <w:lang w:val="en-US"/>
-        </w:rPr>
-      </w:pPr>
-      <w:bookmarkStart w:id="18" w:name="_Toc221128506"/>
-      <w:r>
-        <w:rPr>
-          <w:lang w:val="en-US"/>
-        </w:rPr>
-        <w:t>Content A1b</w:t>
-      </w:r>
-      <w:bookmarkEnd w:id="18"/>
-    </w:p>
-    <w:p>
-      <w:pPr>
-        <w:rPr>
-          <w:lang w:val="en-US"/>
-        </w:rPr>
-      </w:pPr>
-      <w:r>
-        <w:rPr>
-          <w:lang w:val="en-US"/>
-        </w:rPr>
-        <w:t>Lorem ipsum dolor sit amet</w:t>
-      </w:r>
-      <w:sdt>
-        <w:sdtPr>
-          <w:id w:val="-894586678"/>
-          <w:citation/>
-        </w:sdtPr>
-        <w:sdtContent>
-          <w:r>
-            <w:fldChar w:fldCharType="begin"/>
-          </w:r>
-          <w:r>
-            <w:rPr>
-              <w:lang w:val="en-US"/>
-            </w:rPr>
-            <w:instrText xml:space="preserve"> CITATION Don68 \l 1033 </w:instrText>
-          </w:r>
-          <w:r>
-            <w:fldChar w:fldCharType="separate"/>
-          </w:r>
-          <w:r>
-            <w:rPr>
-              <w:noProof/>
-              <w:lang w:val="en-US"/>
-            </w:rPr>
-            <w:t xml:space="preserve"> </w:t>
-          </w:r>
-          <w:r>
-            <w:rPr>
-              <w:noProof/>
-              <w:lang w:val="en-US"/>
-            </w:rPr>
-            <w:t>[1]</w:t>
-          </w:r>
-          <w:r>
-            <w:fldChar w:fldCharType="end"/>
-          </w:r>
-        </w:sdtContent>
-      </w:sdt>
-      <w:r>
-        <w:rPr>
-          <w:lang w:val="en-US"/>
-        </w:rPr>
-        <w:t xml:space="preserve">, consectetur adipiscing elit. Aenean viverra eget sapien in fringilla. Proin ac neque non lectus vehicula laoreet in cursus enim. Donec et erat ut erat commodo viverra vitae sed risus. Etiam tortor justo, placerat in turpis sit amet, egestas tristique libero. Phasellus metus arcu, viverra at interdum ac, convallis non urna. </w:t>
-      </w:r>
-      <w:r>
-        <w:t>Sed nunc libero,</w:t>
-      </w:r>
-    </w:p>
-    <w:p>
-      <w:pPr>
-        <w:pStyle w:val="berschrift2"/>
-        <w:rPr>
-          <w:lang w:val="en-US"/>
-        </w:rPr>
-      </w:pPr>
-      <w:bookmarkStart w:id="19" w:name="_Toc221128507"/>
-      <w:r>
-        <w:rPr>
-          <w:lang w:val="en-US"/>
-        </w:rPr>
-        <w:t>Content A2</w:t>
-      </w:r>
-      <w:bookmarkEnd w:id="19"/>
-    </w:p>
-    <w:p>
-      <w:pPr>
-        <w:rPr>
-          <w:lang w:val="en-US"/>
-        </w:rPr>
-      </w:pPr>
-      <w:r>
-        <w:rPr>
-          <w:lang w:val="en-US"/>
-        </w:rPr>
-        <w:t xml:space="preserve">Lorem ipsum dolor sit amet, consectetur adipiscing elit. </w:t>
-      </w:r>
-      <w:r>
-        <w:t xml:space="preserve">Aenean viverra eget sapien in fringilla. </w:t>
-      </w:r>
-      <w:r>
-        <w:rPr>
-          <w:lang w:val="en-US"/>
-        </w:rPr>
-        <w:t>Proin ac neque non lectus vehicula laoreet in cursus enim. Donec et erat ut erat commodo viverra vitae sed risus. Etiam tortor justo, placerat in turpis sit amet, egestas tristique libero. Phasellus metus arcu, viverra at interdum ac, convallis non urna. Sed nunc libero, elementum quis ultricies at, vestibulum in arcu. Nam ultrices felis ut sagittis hendrerit. Vivamus massa sapien, interdum nec dui ac, consectetur venenatis dolor. Integer enim felis, finibus at efficitur eget, viverra vitae purus. Curabitur at libero pretium, vestibulum lacus at, eleifend nisl.</w:t>
-      </w:r>
-    </w:p>
-    <w:p>
-      <w:pPr>
-        <w:rPr>
-          <w:lang w:val="en-US"/>
-        </w:rPr>
-      </w:pPr>
-      <w:r>
-        <w:rPr>
-          <w:lang w:val="en-US"/>
-        </w:rPr>
-        <w:t>Nullam ut magna quis ante gravida aliquet. Integer ultricies libero vitae quam mollis, non tincidunt justo posuere. Mauris ultricies varius orci non tempus. Sed at ex maximus, tempor libero id, convallis ligula. Donec posuere massa sit amet porttitor vehicula. Donec porttitor luctus dui sed blandit. Ut egestas, enim id egestas auctor, est ligula accumsan diam, nec lacinia massa elit vitae purus.</w:t>
-      </w:r>
-    </w:p>
-    <w:p>
-      <w:pPr>
-        <w:rPr>
-          <w:lang w:val="en-US"/>
-        </w:rPr>
-      </w:pPr>
-      <w:r>
-        <w:rPr>
-          <w:lang w:val="en-US"/>
-        </w:rPr>
-        <w:t xml:space="preserve">Ut consectetur ipsum id nisl sodales varius. Pellentesque habitant morbi tristique senectus et netus et malesuada fames ac turpis egestas. Aliquam venenatis varius maximus. Aenean aliquet mi a magna tempor, et sagittis ligula tincidunt. Maecenas ornare non leo et dignissim. Nunc ac feugiat magna. Nulla at sollicitudin massa, nec sollicitudin libero. Nunc posuere dolor mauris, non congue neque lobortis eget. Vestibulum ex leo, ullamcorper quis malesuada in, maximus quis nisl. Morbi neque diam, dignissim non suscipit ac, molestie at sem. In hac </w:t>
-      </w:r>
-      <w:r>
-        <w:rPr>
-          <w:lang w:val="en-US"/>
-        </w:rPr>
-        <w:lastRenderedPageBreak/>
-        <w:t>habitasse platea dictumst. Curabitur dictum eros non ipsum luctus, a malesuada sapien iaculis. Nam mauris nisi, sodales et consectetur quis, varius eu lacus.</w:t>
-      </w:r>
+        <w:t>App Development</w:t>
+      </w:r>
+    </w:p>
+    <w:p>
+      <w:pPr>
+        <w:rPr>
+          <w:lang w:val="en-US"/>
+        </w:rPr>
+      </w:pPr>
+      <w:r>
+        <w:rPr>
+          <w:lang w:val="en-US"/>
+        </w:rPr>
+        <w:t>Ut consectetur ipsum id nisl sodales varius. Pellentesque habitant morbi tristique senectus et netus et malesuada fames ac turpis egestas. Aliquam venenatis varius maximus. Aenean aliquet mi a magna tempor, et sagittis ligula tincidunt. Maecenas ornare non leo et dignissim. Nunc ac feugiat magna. Nulla at sollicitudin massa, nec sollicitudin libero. Nunc posuere dolor mauris, non congue neque lobortis eget. Vestibulum ex leo, ullamcorper quis malesuada in, maximus quis nisl. Morbi neque diam, dignissim non suscipit ac, molestie at sem. In hac habitasse platea dictumst. Curabitur dictum eros non ipsum luctus, a malesuada sapien iaculis. Nam mauris nisi, sodales et consectetur quis, varius eu lacus.</w:t>
+      </w:r>
+    </w:p>
+    <w:p>
+      <w:pPr>
+        <w:rPr>
+          <w:lang w:val="en-US"/>
+        </w:rPr>
+      </w:pPr>
+      <w:r>
+        <w:rPr>
+          <w:lang w:val="en-US"/>
+        </w:rPr>
+        <w:t>Ut consectetur ipsum id nisl sodales varius. Pellentesque habitant morbi tristique senectus et netus et malesuada fames ac turpis egestas. Aliquam venenatis varius maximus. Aenean aliquet mi a magna tempor, et sagittis ligula tincidunt. Maecenas ornare non leo et dignissim. Nunc ac feugiat magna. Nulla at sollicitudin massa, nec sollicitudin libero. Nunc posuere dolor mauris, non congue neque lobortis eget. Vestibulum ex leo, ullamcorper quis malesuada in, maximus quis nisl. Morbi neque diam, dignissim non suscipit ac, molestie at sem. In hac habitasse platea dictumst. Curabitur dictum eros non ipsum luctus, a malesuada sapien iaculis. Nam mauris nisi, sodales et consectetur quis, varius eu lacus.</w:t>
+      </w:r>
+    </w:p>
+    <w:p>
+      <w:pPr>
+        <w:rPr>
+          <w:lang w:val="en-US"/>
+        </w:rPr>
+      </w:pPr>
+      <w:r>
+        <w:rPr>
+          <w:lang w:val="en-US"/>
+        </w:rPr>
+        <w:t>Ut consectetur ipsum id nisl sodales varius. Pellentesque habitant morbi tristique senectus et netus et malesuada fames ac turpis egestas. Aliquam venenatis varius maximus. Aenean aliquet mi a magna tempor, et sagittis ligula tincidunt. Maecenas ornare non leo et dignissim. Nunc ac feugiat magna. Nulla at sollicitudin massa, nec sollicitudin libero. Nunc posuere dolor mauris, non congue neque lobortis eget. Vestibulum ex leo, ullamcorper quis malesuada in, maximus quis nisl. Morbi neque diam, dignissim non suscipit ac, molestie at sem. In hac habitasse platea dictumst. Curabitur dictum eros non ipsum luctus, a malesuada sapien iaculis. Nam mauris nisi, sodales et consectetur quis, varius eu lacus.</w:t>
+      </w:r>
+    </w:p>
+    <w:p>
+      <w:pPr>
+        <w:rPr>
+          <w:lang w:val="en-US"/>
+        </w:rPr>
+      </w:pPr>
     </w:p>
     <w:p>
       <w:pPr>
@@ -6329,94 +8450,7 @@
           <w:lang w:val="en-US"/>
         </w:rPr>
       </w:pPr>
-      <w:bookmarkStart w:id="20" w:name="_Toc221128508"/>
-      <w:r>
-        <w:rPr>
-          <w:lang w:val="en-US"/>
-        </w:rPr>
-        <w:lastRenderedPageBreak/>
-        <w:t>Content B</w:t>
-      </w:r>
-      <w:bookmarkEnd w:id="20"/>
-    </w:p>
-    <w:p>
-      <w:pPr>
-        <w:rPr>
-          <w:lang w:val="en-US"/>
-        </w:rPr>
-      </w:pPr>
-      <w:r>
-        <w:rPr>
-          <w:lang w:val="en-US"/>
-        </w:rPr>
-        <w:t xml:space="preserve">Lorem ipsum dolor sit amet, consectetur adipiscing elit. </w:t>
-      </w:r>
-      <w:r>
-        <w:t xml:space="preserve">Aenean viverra eget sapien in fringilla. </w:t>
-      </w:r>
-      <w:r>
-        <w:rPr>
-          <w:lang w:val="en-US"/>
-        </w:rPr>
-        <w:t>Proin ac neque non lectus vehicula laoreet in cursus enim. Donec et erat ut erat commodo viverra vitae sed risus. Etiam tortor justo, placerat in turpis sit amet, egestas tristique libero. Phasellus metus arcu, viverra at interdum ac, convallis non urna. Sed nunc libero, elementum quis ultricies at, vestibulum in arcu. Nam ultrices felis ut sagittis hendrerit. Vivamus massa sapien, interdum nec dui ac, consectetur venenatis dolor. Integer enim felis, finibus at efficitur eget, viverra vitae purus. Curabitur at libero pretium, vestibulum lacus at, eleifend nisl.</w:t>
-      </w:r>
-    </w:p>
-    <w:p>
-      <w:pPr>
-        <w:pStyle w:val="berschrift2"/>
-        <w:rPr>
-          <w:lang w:val="en-US"/>
-        </w:rPr>
-      </w:pPr>
-      <w:bookmarkStart w:id="21" w:name="_Toc221128509"/>
-      <w:r>
-        <w:rPr>
-          <w:lang w:val="en-US"/>
-        </w:rPr>
-        <w:t>Content B Subsection</w:t>
-      </w:r>
-      <w:bookmarkEnd w:id="21"/>
-    </w:p>
-    <w:p>
-      <w:pPr>
-        <w:rPr>
-          <w:lang w:val="en-US"/>
-        </w:rPr>
-      </w:pPr>
-      <w:r>
-        <w:rPr>
-          <w:lang w:val="en-US"/>
-        </w:rPr>
-        <w:t xml:space="preserve">Nullam ut magna quis ante gravida aliquet. Integer ultricies libero vitae quam mollis, non tincidunt justo posuere. </w:t>
-      </w:r>
-      <w:r>
-        <w:rPr>
-          <w:lang w:val="en-US"/>
-        </w:rPr>
-        <w:t>Mauris ultricies varius orci non tempus. Sed at ex maximus, tempor libero id, convallis ligula. Donec posuere massa sit amet porttitor vehicula. Donec porttitor luctus dui sed blandit. Ut egestas, enim id egestas auctor, est ligula accumsan diam, nec lacinia massa elit vitae purus.</w:t>
-      </w:r>
-    </w:p>
-    <w:p>
-      <w:pPr>
-        <w:rPr>
-          <w:lang w:val="en-US"/>
-        </w:rPr>
-      </w:pPr>
-      <w:r>
-        <w:rPr>
-          <w:lang w:val="en-US"/>
-        </w:rPr>
-        <w:t>Ut consectetur ipsum id nisl sodales varius. Pellentesque habitant morbi tristique senectus et netus et malesuada fames ac turpis egestas. Aliquam venenatis varius maximus. Aenean aliquet mi a magna tempor, et sagittis ligula tincidunt. Maecenas ornare non leo et dignissim. Nunc ac feugiat magna. Nulla at sollicitudin massa, nec sollicitudin libero. Nunc posuere dolor mauris, non congue neque lobortis eget. Vestibulum ex leo, ullamcorper quis malesuada in, maximus quis nisl. Morbi neque diam, dignissim non suscipit ac, molestie at sem. In hac habitasse platea dictumst. Curabitur dictum eros non ipsum luctus, a malesuada sapien iaculis. Nam mauris nisi, sodales et consectetur quis, varius eu lacus.</w:t>
-      </w:r>
-    </w:p>
-    <w:p>
-      <w:pPr>
-        <w:pStyle w:val="berschrift1"/>
-        <w:rPr>
-          <w:lang w:val="en-US"/>
-        </w:rPr>
-      </w:pPr>
-      <w:bookmarkStart w:id="22" w:name="_Toc221128510"/>
+      <w:bookmarkStart w:id="14" w:name="_Toc221128510"/>
       <w:r>
         <w:rPr>
           <w:lang w:val="en-US"/>
@@ -6424,7 +8458,7 @@
         <w:lastRenderedPageBreak/>
         <w:t>Content C</w:t>
       </w:r>
-      <w:bookmarkEnd w:id="22"/>
+      <w:bookmarkEnd w:id="14"/>
     </w:p>
     <w:p>
       <w:pPr>
@@ -6481,7 +8515,7 @@
           <w:lang w:val="en-US"/>
         </w:rPr>
       </w:pPr>
-      <w:bookmarkStart w:id="23" w:name="_Toc221128511"/>
+      <w:bookmarkStart w:id="15" w:name="_Toc221128511"/>
       <w:r>
         <w:rPr>
           <w:lang w:val="en-US"/>
@@ -6489,7 +8523,7 @@
         <w:lastRenderedPageBreak/>
         <w:t>Case Study / Evaluation</w:t>
       </w:r>
-      <w:bookmarkEnd w:id="23"/>
+      <w:bookmarkEnd w:id="15"/>
     </w:p>
     <w:p>
       <w:pPr>
@@ -6546,7 +8580,7 @@
           <w:lang w:val="en-US"/>
         </w:rPr>
       </w:pPr>
-      <w:bookmarkStart w:id="24" w:name="_Toc221128512"/>
+      <w:bookmarkStart w:id="16" w:name="_Toc221128512"/>
       <w:r>
         <w:rPr>
           <w:lang w:val="en-US"/>
@@ -6554,7 +8588,7 @@
         <w:lastRenderedPageBreak/>
         <w:t>Project Management</w:t>
       </w:r>
-      <w:bookmarkEnd w:id="24"/>
+      <w:bookmarkEnd w:id="16"/>
     </w:p>
     <w:p>
       <w:pPr>
@@ -6643,18 +8677,22 @@
       <w:pPr>
         <w:pStyle w:val="berschrift2"/>
         <w:rPr>
-          <w:lang w:val="en-US"/>
-        </w:rPr>
-      </w:pPr>
-      <w:bookmarkStart w:id="25" w:name="_Toc221128513"/>
-      <w:r>
-        <w:rPr>
+          <w:i w:val="0"/>
+          <w:iCs w:val="0"/>
+          <w:lang w:val="en-US"/>
+        </w:rPr>
+      </w:pPr>
+      <w:bookmarkStart w:id="17" w:name="_Toc221128513"/>
+      <w:r>
+        <w:rPr>
+          <w:i w:val="0"/>
+          <w:iCs w:val="0"/>
           <w:lang w:val="en-US"/>
         </w:rPr>
         <w:lastRenderedPageBreak/>
         <w:t>Planning</w:t>
       </w:r>
-      <w:bookmarkEnd w:id="25"/>
+      <w:bookmarkEnd w:id="17"/>
     </w:p>
     <w:p>
       <w:pPr>
@@ -6667,17 +8705,21 @@
       <w:pPr>
         <w:pStyle w:val="berschrift2"/>
         <w:rPr>
-          <w:lang w:val="en-US"/>
-        </w:rPr>
-      </w:pPr>
-      <w:bookmarkStart w:id="26" w:name="_Toc221128514"/>
-      <w:r>
-        <w:rPr>
+          <w:i w:val="0"/>
+          <w:iCs w:val="0"/>
+          <w:lang w:val="en-US"/>
+        </w:rPr>
+      </w:pPr>
+      <w:bookmarkStart w:id="18" w:name="_Toc221128514"/>
+      <w:r>
+        <w:rPr>
+          <w:i w:val="0"/>
+          <w:iCs w:val="0"/>
           <w:lang w:val="en-US"/>
         </w:rPr>
         <w:t>Evaluation</w:t>
       </w:r>
-      <w:bookmarkEnd w:id="26"/>
+      <w:bookmarkEnd w:id="18"/>
     </w:p>
     <w:p>
       <w:pPr>
@@ -6710,7 +8752,7 @@
           <w:lang w:val="en-US"/>
         </w:rPr>
       </w:pPr>
-      <w:bookmarkStart w:id="27" w:name="_Toc221128515"/>
+      <w:bookmarkStart w:id="19" w:name="_Toc221128515"/>
       <w:r>
         <w:rPr>
           <w:lang w:val="en-US"/>
@@ -6718,7 +8760,7 @@
         <w:lastRenderedPageBreak/>
         <w:t>Timesheet</w:t>
       </w:r>
-      <w:bookmarkEnd w:id="27"/>
+      <w:bookmarkEnd w:id="19"/>
     </w:p>
     <w:p>
       <w:pPr>
@@ -6727,14 +8769,14 @@
           <w:lang w:val="en-US"/>
         </w:rPr>
       </w:pPr>
-      <w:bookmarkStart w:id="28" w:name="_Toc221128516"/>
+      <w:bookmarkStart w:id="20" w:name="_Toc221128516"/>
       <w:r>
         <w:rPr>
           <w:lang w:val="en-US"/>
         </w:rPr>
         <w:t>Student A</w:t>
       </w:r>
-      <w:bookmarkEnd w:id="28"/>
+      <w:bookmarkEnd w:id="20"/>
     </w:p>
     <w:tbl>
       <w:tblPr>
@@ -7313,7 +9355,7 @@
           <w:lang w:val="en-US"/>
         </w:rPr>
       </w:pPr>
-      <w:bookmarkStart w:id="29" w:name="_Toc221128517"/>
+      <w:bookmarkStart w:id="21" w:name="_Toc221128517"/>
       <w:r>
         <w:rPr>
           <w:lang w:val="en-US"/>
@@ -7321,7 +9363,7 @@
         <w:lastRenderedPageBreak/>
         <w:t>Student B</w:t>
       </w:r>
-      <w:bookmarkEnd w:id="29"/>
+      <w:bookmarkEnd w:id="21"/>
     </w:p>
     <w:p>
       <w:pPr>
@@ -7899,7 +9941,7 @@
           <w:lang w:val="en-US"/>
         </w:rPr>
       </w:pPr>
-      <w:bookmarkStart w:id="30" w:name="_Toc221128518"/>
+      <w:bookmarkStart w:id="22" w:name="_Toc221128518"/>
       <w:r>
         <w:rPr>
           <w:lang w:val="en-US"/>
@@ -7907,7 +9949,7 @@
         <w:lastRenderedPageBreak/>
         <w:t>Future Work</w:t>
       </w:r>
-      <w:bookmarkEnd w:id="30"/>
+      <w:bookmarkEnd w:id="22"/>
     </w:p>
     <w:p>
       <w:pPr>
@@ -7964,7 +10006,7 @@
           <w:lang w:val="en-US"/>
         </w:rPr>
       </w:pPr>
-      <w:bookmarkStart w:id="31" w:name="_Toc221128519"/>
+      <w:bookmarkStart w:id="23" w:name="_Toc221128519"/>
       <w:r>
         <w:rPr>
           <w:lang w:val="en-US"/>
@@ -7972,7 +10014,7 @@
         <w:lastRenderedPageBreak/>
         <w:t>Related Work</w:t>
       </w:r>
-      <w:bookmarkEnd w:id="31"/>
+      <w:bookmarkEnd w:id="23"/>
     </w:p>
     <w:p>
       <w:pPr>
@@ -8029,7 +10071,7 @@
           <w:lang w:val="en-US"/>
         </w:rPr>
       </w:pPr>
-      <w:bookmarkStart w:id="32" w:name="_Toc221128520"/>
+      <w:bookmarkStart w:id="24" w:name="_Toc221128520"/>
       <w:r>
         <w:rPr>
           <w:lang w:val="en-US"/>
@@ -8037,7 +10079,7 @@
         <w:lastRenderedPageBreak/>
         <w:t>Conclusion</w:t>
       </w:r>
-      <w:bookmarkEnd w:id="32"/>
+      <w:bookmarkEnd w:id="24"/>
     </w:p>
     <w:p>
       <w:pPr>
@@ -8099,7 +10141,7 @@
           <w:lang w:val="en-US"/>
         </w:rPr>
       </w:pPr>
-      <w:bookmarkStart w:id="33" w:name="_Toc221128521"/>
+      <w:bookmarkStart w:id="25" w:name="_Toc221128521"/>
       <w:r>
         <w:rPr>
           <w:lang w:val="en-US"/>
@@ -8107,7 +10149,7 @@
         <w:lastRenderedPageBreak/>
         <w:t>Acknowledgements</w:t>
       </w:r>
-      <w:bookmarkEnd w:id="33"/>
+      <w:bookmarkEnd w:id="25"/>
     </w:p>
     <w:p>
       <w:pPr>
@@ -8169,7 +10211,7 @@
           <w:lang w:val="en-US"/>
         </w:rPr>
       </w:pPr>
-      <w:bookmarkStart w:id="34" w:name="_Toc221128522"/>
+      <w:bookmarkStart w:id="26" w:name="_Toc221128522"/>
       <w:r>
         <w:rPr>
           <w:lang w:val="en-US"/>
@@ -8177,7 +10219,7 @@
         <w:lastRenderedPageBreak/>
         <w:t>List of Figures</w:t>
       </w:r>
-      <w:bookmarkEnd w:id="34"/>
+      <w:bookmarkEnd w:id="26"/>
     </w:p>
     <w:p>
       <w:pPr>
@@ -8210,7 +10252,7 @@
         </w:rPr>
         <w:fldChar w:fldCharType="separate"/>
       </w:r>
-      <w:hyperlink r:id="rId12" w:anchor="_Toc65672349" w:history="1">
+      <w:hyperlink r:id="rId13" w:anchor="_Toc65672349" w:history="1">
         <w:r>
           <w:rPr>
             <w:rStyle w:val="Hyperlink"/>
@@ -8288,7 +10330,7 @@
         </w:rPr>
       </w:pPr>
     </w:p>
-    <w:bookmarkStart w:id="35" w:name="_Toc221128523" w:displacedByCustomXml="next"/>
+    <w:bookmarkStart w:id="27" w:name="_Toc221128523" w:displacedByCustomXml="next"/>
     <w:sdt>
       <w:sdtPr>
         <w:rPr>
@@ -8305,6 +10347,7 @@
           <w:docPartUnique/>
         </w:docPartObj>
       </w:sdtPr>
+      <w:sdtEndPr/>
       <w:sdtContent>
         <w:p>
           <w:pPr>
@@ -8318,13 +10361,14 @@
           <w:r>
             <w:t>Bibliography</w:t>
           </w:r>
-          <w:bookmarkEnd w:id="35"/>
+          <w:bookmarkEnd w:id="27"/>
         </w:p>
         <w:sdt>
           <w:sdtPr>
             <w:id w:val="1554960046"/>
             <w:bibliography/>
           </w:sdtPr>
+          <w:sdtEndPr/>
           <w:sdtContent>
             <w:p>
               <w:pPr>
@@ -8554,11 +10598,7 @@
           </mc:Choice>
           <mc:Fallback>
             <w:pict>
-              <v:shapetype w14:anchorId="08769742" id="_x0000_t202" coordsize="21600,21600" o:spt="202" path="m,l,21600r21600,l21600,xe">
-                <v:stroke joinstyle="miter"/>
-                <v:path gradientshapeok="t" o:connecttype="rect"/>
-              </v:shapetype>
-              <v:shape id="Text Box 3" o:spid="_x0000_s1026" type="#_x0000_t202" style="position:absolute;margin-left:1.95pt;margin-top:-8.35pt;width:445.4pt;height:31pt;z-index:251673600;visibility:visible;mso-wrap-style:square;mso-wrap-distance-left:9pt;mso-wrap-distance-top:0;mso-wrap-distance-right:9pt;mso-wrap-distance-bottom:0;mso-position-horizontal:absolute;mso-position-horizontal-relative:text;mso-position-vertical:absolute;mso-position-vertical-relative:text;v-text-anchor:top" o:gfxdata="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" fillcolor="red" strokeweight=".5pt">
+              <v:shape w14:anchorId="08769742" id="Text Box 3" o:spid="_x0000_s1027" type="#_x0000_t202" style="position:absolute;margin-left:1.95pt;margin-top:-8.35pt;width:445.4pt;height:31pt;z-index:251673600;visibility:visible;mso-wrap-style:square;mso-wrap-distance-left:9pt;mso-wrap-distance-top:0;mso-wrap-distance-right:9pt;mso-wrap-distance-bottom:0;mso-position-horizontal:absolute;mso-position-horizontal-relative:text;mso-position-vertical:absolute;mso-position-vertical-relative:text;v-text-anchor:top" o:gfxdata="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" fillcolor="red" strokeweight=".5pt">
                 <v:textbox>
                   <w:txbxContent>
                     <w:p>
@@ -8893,8 +10933,8 @@
       </w:pPr>
     </w:p>
     <w:sectPr>
-      <w:headerReference w:type="default" r:id="rId13"/>
-      <w:footerReference w:type="default" r:id="rId14"/>
+      <w:headerReference w:type="default" r:id="rId14"/>
+      <w:footerReference w:type="default" r:id="rId15"/>
       <w:type w:val="continuous"/>
       <w:pgSz w:w="11906" w:h="16838"/>
       <w:pgMar w:top="1128" w:right="1418" w:bottom="1134" w:left="1418" w:header="709" w:footer="709" w:gutter="0"/>
@@ -10948,6 +12988,123 @@
     </w:lvl>
   </w:abstractNum>
   <w:abstractNum w:abstractNumId="16" w15:restartNumberingAfterBreak="0">
+    <w:nsid w:val="36A04BB1"/>
+    <w:multiLevelType w:val="multilevel"/>
+    <w:tmpl w:val="14D8FA76"/>
+    <w:lvl w:ilvl="0">
+      <w:start w:val="1"/>
+      <w:numFmt w:val="decimal"/>
+      <w:lvlText w:val="%1."/>
+      <w:lvlJc w:val="left"/>
+      <w:pPr>
+        <w:tabs>
+          <w:tab w:val="num" w:pos="720"/>
+        </w:tabs>
+        <w:ind w:left="720" w:hanging="360"/>
+      </w:pPr>
+      <w:rPr>
+        <w:b/>
+        <w:bCs/>
+      </w:rPr>
+    </w:lvl>
+    <w:lvl w:ilvl="1" w:tentative="1">
+      <w:start w:val="1"/>
+      <w:numFmt w:val="decimal"/>
+      <w:lvlText w:val="%2."/>
+      <w:lvlJc w:val="left"/>
+      <w:pPr>
+        <w:tabs>
+          <w:tab w:val="num" w:pos="1440"/>
+        </w:tabs>
+        <w:ind w:left="1440" w:hanging="360"/>
+      </w:pPr>
+    </w:lvl>
+    <w:lvl w:ilvl="2" w:tentative="1">
+      <w:start w:val="1"/>
+      <w:numFmt w:val="decimal"/>
+      <w:lvlText w:val="%3."/>
+      <w:lvlJc w:val="left"/>
+      <w:pPr>
+        <w:tabs>
+          <w:tab w:val="num" w:pos="2160"/>
+        </w:tabs>
+        <w:ind w:left="2160" w:hanging="360"/>
+      </w:pPr>
+    </w:lvl>
+    <w:lvl w:ilvl="3" w:tentative="1">
+      <w:start w:val="1"/>
+      <w:numFmt w:val="decimal"/>
+      <w:lvlText w:val="%4."/>
+      <w:lvlJc w:val="left"/>
+      <w:pPr>
+        <w:tabs>
+          <w:tab w:val="num" w:pos="2880"/>
+        </w:tabs>
+        <w:ind w:left="2880" w:hanging="360"/>
+      </w:pPr>
+    </w:lvl>
+    <w:lvl w:ilvl="4" w:tentative="1">
+      <w:start w:val="1"/>
+      <w:numFmt w:val="decimal"/>
+      <w:lvlText w:val="%5."/>
+      <w:lvlJc w:val="left"/>
+      <w:pPr>
+        <w:tabs>
+          <w:tab w:val="num" w:pos="3600"/>
+        </w:tabs>
+        <w:ind w:left="3600" w:hanging="360"/>
+      </w:pPr>
+    </w:lvl>
+    <w:lvl w:ilvl="5" w:tentative="1">
+      <w:start w:val="1"/>
+      <w:numFmt w:val="decimal"/>
+      <w:lvlText w:val="%6."/>
+      <w:lvlJc w:val="left"/>
+      <w:pPr>
+        <w:tabs>
+          <w:tab w:val="num" w:pos="4320"/>
+        </w:tabs>
+        <w:ind w:left="4320" w:hanging="360"/>
+      </w:pPr>
+    </w:lvl>
+    <w:lvl w:ilvl="6" w:tentative="1">
+      <w:start w:val="1"/>
+      <w:numFmt w:val="decimal"/>
+      <w:lvlText w:val="%7."/>
+      <w:lvlJc w:val="left"/>
+      <w:pPr>
+        <w:tabs>
+          <w:tab w:val="num" w:pos="5040"/>
+        </w:tabs>
+        <w:ind w:left="5040" w:hanging="360"/>
+      </w:pPr>
+    </w:lvl>
+    <w:lvl w:ilvl="7" w:tentative="1">
+      <w:start w:val="1"/>
+      <w:numFmt w:val="decimal"/>
+      <w:lvlText w:val="%8."/>
+      <w:lvlJc w:val="left"/>
+      <w:pPr>
+        <w:tabs>
+          <w:tab w:val="num" w:pos="5760"/>
+        </w:tabs>
+        <w:ind w:left="5760" w:hanging="360"/>
+      </w:pPr>
+    </w:lvl>
+    <w:lvl w:ilvl="8" w:tentative="1">
+      <w:start w:val="1"/>
+      <w:numFmt w:val="decimal"/>
+      <w:lvlText w:val="%9."/>
+      <w:lvlJc w:val="left"/>
+      <w:pPr>
+        <w:tabs>
+          <w:tab w:val="num" w:pos="6480"/>
+        </w:tabs>
+        <w:ind w:left="6480" w:hanging="360"/>
+      </w:pPr>
+    </w:lvl>
+  </w:abstractNum>
+  <w:abstractNum w:abstractNumId="17" w15:restartNumberingAfterBreak="0">
     <w:nsid w:val="3CEC7B94"/>
     <w:multiLevelType w:val="multilevel"/>
     <w:tmpl w:val="63F88080"/>
@@ -11068,7 +13225,7 @@
       </w:rPr>
     </w:lvl>
   </w:abstractNum>
-  <w:abstractNum w:abstractNumId="17" w15:restartNumberingAfterBreak="0">
+  <w:abstractNum w:abstractNumId="18" w15:restartNumberingAfterBreak="0">
     <w:nsid w:val="3D4A0D83"/>
     <w:multiLevelType w:val="multilevel"/>
     <w:tmpl w:val="2A067BDA"/>
@@ -11214,7 +13371,7 @@
       </w:rPr>
     </w:lvl>
   </w:abstractNum>
-  <w:abstractNum w:abstractNumId="18" w15:restartNumberingAfterBreak="0">
+  <w:abstractNum w:abstractNumId="19" w15:restartNumberingAfterBreak="0">
     <w:nsid w:val="3E5C10A8"/>
     <w:multiLevelType w:val="hybridMultilevel"/>
     <w:tmpl w:val="7E9A7914"/>
@@ -11354,7 +13511,7 @@
       </w:rPr>
     </w:lvl>
   </w:abstractNum>
-  <w:abstractNum w:abstractNumId="19" w15:restartNumberingAfterBreak="0">
+  <w:abstractNum w:abstractNumId="20" w15:restartNumberingAfterBreak="0">
     <w:nsid w:val="40640CB8"/>
     <w:multiLevelType w:val="multilevel"/>
     <w:tmpl w:val="28C8D752"/>
@@ -11494,7 +13651,7 @@
       </w:rPr>
     </w:lvl>
   </w:abstractNum>
-  <w:abstractNum w:abstractNumId="20" w15:restartNumberingAfterBreak="0">
+  <w:abstractNum w:abstractNumId="21" w15:restartNumberingAfterBreak="0">
     <w:nsid w:val="45E93EF0"/>
     <w:multiLevelType w:val="hybridMultilevel"/>
     <w:tmpl w:val="8CA66274"/>
@@ -11607,7 +13764,7 @@
       </w:rPr>
     </w:lvl>
   </w:abstractNum>
-  <w:abstractNum w:abstractNumId="21" w15:restartNumberingAfterBreak="0">
+  <w:abstractNum w:abstractNumId="22" w15:restartNumberingAfterBreak="0">
     <w:nsid w:val="47F84916"/>
     <w:multiLevelType w:val="hybridMultilevel"/>
     <w:tmpl w:val="092E9D28"/>
@@ -11747,7 +13904,7 @@
       </w:rPr>
     </w:lvl>
   </w:abstractNum>
-  <w:abstractNum w:abstractNumId="22" w15:restartNumberingAfterBreak="0">
+  <w:abstractNum w:abstractNumId="23" w15:restartNumberingAfterBreak="0">
     <w:nsid w:val="496E3775"/>
     <w:multiLevelType w:val="hybridMultilevel"/>
     <w:tmpl w:val="69A0A358"/>
@@ -11833,7 +13990,156 @@
       </w:pPr>
     </w:lvl>
   </w:abstractNum>
-  <w:abstractNum w:abstractNumId="23" w15:restartNumberingAfterBreak="0">
+  <w:abstractNum w:abstractNumId="24" w15:restartNumberingAfterBreak="0">
+    <w:nsid w:val="4BF42675"/>
+    <w:multiLevelType w:val="multilevel"/>
+    <w:tmpl w:val="0BBCABDA"/>
+    <w:lvl w:ilvl="0">
+      <w:start w:val="1"/>
+      <w:numFmt w:val="bullet"/>
+      <w:lvlText w:val=""/>
+      <w:lvlJc w:val="left"/>
+      <w:pPr>
+        <w:tabs>
+          <w:tab w:val="num" w:pos="720"/>
+        </w:tabs>
+        <w:ind w:left="720" w:hanging="360"/>
+      </w:pPr>
+      <w:rPr>
+        <w:rFonts w:ascii="Symbol" w:hAnsi="Symbol" w:hint="default"/>
+        <w:sz w:val="20"/>
+      </w:rPr>
+    </w:lvl>
+    <w:lvl w:ilvl="1" w:tentative="1">
+      <w:start w:val="1"/>
+      <w:numFmt w:val="bullet"/>
+      <w:lvlText w:val="o"/>
+      <w:lvlJc w:val="left"/>
+      <w:pPr>
+        <w:tabs>
+          <w:tab w:val="num" w:pos="1440"/>
+        </w:tabs>
+        <w:ind w:left="1440" w:hanging="360"/>
+      </w:pPr>
+      <w:rPr>
+        <w:rFonts w:ascii="Courier New" w:hAnsi="Courier New" w:hint="default"/>
+        <w:sz w:val="20"/>
+      </w:rPr>
+    </w:lvl>
+    <w:lvl w:ilvl="2" w:tentative="1">
+      <w:start w:val="1"/>
+      <w:numFmt w:val="bullet"/>
+      <w:lvlText w:val=""/>
+      <w:lvlJc w:val="left"/>
+      <w:pPr>
+        <w:tabs>
+          <w:tab w:val="num" w:pos="2160"/>
+        </w:tabs>
+        <w:ind w:left="2160" w:hanging="360"/>
+      </w:pPr>
+      <w:rPr>
+        <w:rFonts w:ascii="Wingdings" w:hAnsi="Wingdings" w:hint="default"/>
+        <w:sz w:val="20"/>
+      </w:rPr>
+    </w:lvl>
+    <w:lvl w:ilvl="3" w:tentative="1">
+      <w:start w:val="1"/>
+      <w:numFmt w:val="bullet"/>
+      <w:lvlText w:val=""/>
+      <w:lvlJc w:val="left"/>
+      <w:pPr>
+        <w:tabs>
+          <w:tab w:val="num" w:pos="2880"/>
+        </w:tabs>
+        <w:ind w:left="2880" w:hanging="360"/>
+      </w:pPr>
+      <w:rPr>
+        <w:rFonts w:ascii="Wingdings" w:hAnsi="Wingdings" w:hint="default"/>
+        <w:sz w:val="20"/>
+      </w:rPr>
+    </w:lvl>
+    <w:lvl w:ilvl="4" w:tentative="1">
+      <w:start w:val="1"/>
+      <w:numFmt w:val="bullet"/>
+      <w:lvlText w:val=""/>
+      <w:lvlJc w:val="left"/>
+      <w:pPr>
+        <w:tabs>
+          <w:tab w:val="num" w:pos="3600"/>
+        </w:tabs>
+        <w:ind w:left="3600" w:hanging="360"/>
+      </w:pPr>
+      <w:rPr>
+        <w:rFonts w:ascii="Wingdings" w:hAnsi="Wingdings" w:hint="default"/>
+        <w:sz w:val="20"/>
+      </w:rPr>
+    </w:lvl>
+    <w:lvl w:ilvl="5" w:tentative="1">
+      <w:start w:val="1"/>
+      <w:numFmt w:val="bullet"/>
+      <w:lvlText w:val=""/>
+      <w:lvlJc w:val="left"/>
+      <w:pPr>
+        <w:tabs>
+          <w:tab w:val="num" w:pos="4320"/>
+        </w:tabs>
+        <w:ind w:left="4320" w:hanging="360"/>
+      </w:pPr>
+      <w:rPr>
+        <w:rFonts w:ascii="Wingdings" w:hAnsi="Wingdings" w:hint="default"/>
+        <w:sz w:val="20"/>
+      </w:rPr>
+    </w:lvl>
+    <w:lvl w:ilvl="6" w:tentative="1">
+      <w:start w:val="1"/>
+      <w:numFmt w:val="bullet"/>
+      <w:lvlText w:val=""/>
+      <w:lvlJc w:val="left"/>
+      <w:pPr>
+        <w:tabs>
+          <w:tab w:val="num" w:pos="5040"/>
+        </w:tabs>
+        <w:ind w:left="5040" w:hanging="360"/>
+      </w:pPr>
+      <w:rPr>
+        <w:rFonts w:ascii="Wingdings" w:hAnsi="Wingdings" w:hint="default"/>
+        <w:sz w:val="20"/>
+      </w:rPr>
+    </w:lvl>
+    <w:lvl w:ilvl="7" w:tentative="1">
+      <w:start w:val="1"/>
+      <w:numFmt w:val="bullet"/>
+      <w:lvlText w:val=""/>
+      <w:lvlJc w:val="left"/>
+      <w:pPr>
+        <w:tabs>
+          <w:tab w:val="num" w:pos="5760"/>
+        </w:tabs>
+        <w:ind w:left="5760" w:hanging="360"/>
+      </w:pPr>
+      <w:rPr>
+        <w:rFonts w:ascii="Wingdings" w:hAnsi="Wingdings" w:hint="default"/>
+        <w:sz w:val="20"/>
+      </w:rPr>
+    </w:lvl>
+    <w:lvl w:ilvl="8" w:tentative="1">
+      <w:start w:val="1"/>
+      <w:numFmt w:val="bullet"/>
+      <w:lvlText w:val=""/>
+      <w:lvlJc w:val="left"/>
+      <w:pPr>
+        <w:tabs>
+          <w:tab w:val="num" w:pos="6480"/>
+        </w:tabs>
+        <w:ind w:left="6480" w:hanging="360"/>
+      </w:pPr>
+      <w:rPr>
+        <w:rFonts w:ascii="Wingdings" w:hAnsi="Wingdings" w:hint="default"/>
+        <w:sz w:val="20"/>
+      </w:rPr>
+    </w:lvl>
+  </w:abstractNum>
+  <w:abstractNum w:abstractNumId="25" w15:restartNumberingAfterBreak="0">
     <w:nsid w:val="4E9C06DC"/>
     <w:multiLevelType w:val="hybridMultilevel"/>
     <w:tmpl w:val="FDB0EB32"/>
@@ -11922,7 +14228,7 @@
       </w:pPr>
     </w:lvl>
   </w:abstractNum>
-  <w:abstractNum w:abstractNumId="24" w15:restartNumberingAfterBreak="0">
+  <w:abstractNum w:abstractNumId="26" w15:restartNumberingAfterBreak="0">
     <w:nsid w:val="5C4D3ABC"/>
     <w:multiLevelType w:val="multilevel"/>
     <w:tmpl w:val="C6903B8A"/>
@@ -12039,7 +14345,7 @@
       </w:pPr>
     </w:lvl>
   </w:abstractNum>
-  <w:abstractNum w:abstractNumId="25" w15:restartNumberingAfterBreak="0">
+  <w:abstractNum w:abstractNumId="27" w15:restartNumberingAfterBreak="0">
     <w:nsid w:val="64B82E6E"/>
     <w:multiLevelType w:val="hybridMultilevel"/>
     <w:tmpl w:val="D0747A00"/>
@@ -12125,7 +14431,7 @@
       </w:pPr>
     </w:lvl>
   </w:abstractNum>
-  <w:abstractNum w:abstractNumId="26" w15:restartNumberingAfterBreak="0">
+  <w:abstractNum w:abstractNumId="28" w15:restartNumberingAfterBreak="0">
     <w:nsid w:val="665B03E1"/>
     <w:multiLevelType w:val="multilevel"/>
     <w:tmpl w:val="63F88080"/>
@@ -12246,7 +14552,7 @@
       </w:rPr>
     </w:lvl>
   </w:abstractNum>
-  <w:abstractNum w:abstractNumId="27" w15:restartNumberingAfterBreak="0">
+  <w:abstractNum w:abstractNumId="29" w15:restartNumberingAfterBreak="0">
     <w:nsid w:val="75910B27"/>
     <w:multiLevelType w:val="hybridMultilevel"/>
     <w:tmpl w:val="2F287598"/>
@@ -12359,7 +14665,7 @@
       </w:rPr>
     </w:lvl>
   </w:abstractNum>
-  <w:abstractNum w:abstractNumId="28" w15:restartNumberingAfterBreak="0">
+  <w:abstractNum w:abstractNumId="30" w15:restartNumberingAfterBreak="0">
     <w:nsid w:val="76271099"/>
     <w:multiLevelType w:val="hybridMultilevel"/>
     <w:tmpl w:val="DC60DAD8"/>
@@ -12445,7 +14751,7 @@
       </w:pPr>
     </w:lvl>
   </w:abstractNum>
-  <w:abstractNum w:abstractNumId="29" w15:restartNumberingAfterBreak="0">
+  <w:abstractNum w:abstractNumId="31" w15:restartNumberingAfterBreak="0">
     <w:nsid w:val="777C2055"/>
     <w:multiLevelType w:val="hybridMultilevel"/>
     <w:tmpl w:val="E4DA12C4"/>
@@ -12531,7 +14837,7 @@
       </w:pPr>
     </w:lvl>
   </w:abstractNum>
-  <w:abstractNum w:abstractNumId="30" w15:restartNumberingAfterBreak="0">
+  <w:abstractNum w:abstractNumId="32" w15:restartNumberingAfterBreak="0">
     <w:nsid w:val="7FCC1516"/>
     <w:multiLevelType w:val="multilevel"/>
     <w:tmpl w:val="63F88080"/>
@@ -12653,19 +14959,19 @@
     </w:lvl>
   </w:abstractNum>
   <w:num w:numId="1" w16cid:durableId="20516622">
-    <w:abstractNumId w:val="17"/>
+    <w:abstractNumId w:val="18"/>
   </w:num>
   <w:num w:numId="2" w16cid:durableId="1413619856">
-    <w:abstractNumId w:val="18"/>
+    <w:abstractNumId w:val="19"/>
   </w:num>
   <w:num w:numId="3" w16cid:durableId="1659191170">
     <w:abstractNumId w:val="4"/>
   </w:num>
   <w:num w:numId="4" w16cid:durableId="576667798">
-    <w:abstractNumId w:val="21"/>
+    <w:abstractNumId w:val="22"/>
   </w:num>
   <w:num w:numId="5" w16cid:durableId="1576668777">
-    <w:abstractNumId w:val="19"/>
+    <w:abstractNumId w:val="20"/>
   </w:num>
   <w:num w:numId="6" w16cid:durableId="2000383999">
     <w:abstractNumId w:val="9"/>
@@ -12674,13 +14980,13 @@
     <w:abstractNumId w:val="6"/>
   </w:num>
   <w:num w:numId="8" w16cid:durableId="1625768317">
-    <w:abstractNumId w:val="22"/>
+    <w:abstractNumId w:val="23"/>
   </w:num>
   <w:num w:numId="9" w16cid:durableId="67194664">
-    <w:abstractNumId w:val="28"/>
+    <w:abstractNumId w:val="30"/>
   </w:num>
   <w:num w:numId="10" w16cid:durableId="800927756">
-    <w:abstractNumId w:val="25"/>
+    <w:abstractNumId w:val="27"/>
   </w:num>
   <w:num w:numId="11" w16cid:durableId="1911386746">
     <w:abstractNumId w:val="11"/>
@@ -12689,19 +14995,19 @@
     <w:abstractNumId w:val="13"/>
   </w:num>
   <w:num w:numId="13" w16cid:durableId="1439909954">
-    <w:abstractNumId w:val="29"/>
+    <w:abstractNumId w:val="31"/>
   </w:num>
   <w:num w:numId="14" w16cid:durableId="724646003">
     <w:abstractNumId w:val="5"/>
   </w:num>
   <w:num w:numId="15" w16cid:durableId="1000815684">
-    <w:abstractNumId w:val="30"/>
+    <w:abstractNumId w:val="32"/>
   </w:num>
   <w:num w:numId="16" w16cid:durableId="2060586454">
-    <w:abstractNumId w:val="26"/>
+    <w:abstractNumId w:val="28"/>
   </w:num>
   <w:num w:numId="17" w16cid:durableId="1417901530">
-    <w:abstractNumId w:val="16"/>
+    <w:abstractNumId w:val="17"/>
   </w:num>
   <w:num w:numId="18" w16cid:durableId="465509032">
     <w:abstractNumId w:val="12"/>
@@ -12716,7 +15022,7 @@
     <w:abstractNumId w:val="3"/>
   </w:num>
   <w:num w:numId="22" w16cid:durableId="1723019582">
-    <w:abstractNumId w:val="27"/>
+    <w:abstractNumId w:val="29"/>
   </w:num>
   <w:num w:numId="23" w16cid:durableId="727146851">
     <w:abstractNumId w:val="1"/>
@@ -12728,10 +15034,10 @@
     <w:abstractNumId w:val="2"/>
   </w:num>
   <w:num w:numId="26" w16cid:durableId="1414622978">
-    <w:abstractNumId w:val="23"/>
+    <w:abstractNumId w:val="25"/>
   </w:num>
   <w:num w:numId="27" w16cid:durableId="562833278">
-    <w:abstractNumId w:val="20"/>
+    <w:abstractNumId w:val="21"/>
   </w:num>
   <w:num w:numId="28" w16cid:durableId="106436640">
     <w:abstractNumId w:val="14"/>
@@ -12740,10 +15046,16 @@
     <w:abstractNumId w:val="0"/>
   </w:num>
   <w:num w:numId="30" w16cid:durableId="1989433554">
-    <w:abstractNumId w:val="24"/>
+    <w:abstractNumId w:val="26"/>
   </w:num>
   <w:num w:numId="31" w16cid:durableId="1721511726">
     <w:abstractNumId w:val="15"/>
+  </w:num>
+  <w:num w:numId="32" w16cid:durableId="895243464">
+    <w:abstractNumId w:val="24"/>
+  </w:num>
+  <w:num w:numId="33" w16cid:durableId="1232043646">
+    <w:abstractNumId w:val="16"/>
   </w:num>
   <w:numIdMacAtCleanup w:val="7"/>
 </w:numbering>
@@ -13250,6 +15562,7 @@
   <w:style w:type="character" w:default="1" w:styleId="Absatz-Standardschriftart">
     <w:name w:val="Default Paragraph Font"/>
     <w:uiPriority w:val="1"/>
+    <w:semiHidden/>
     <w:unhideWhenUsed/>
   </w:style>
   <w:style w:type="table" w:default="1" w:styleId="NormaleTabelle">
@@ -13796,6 +16109,44 @@
       <w:szCs w:val="20"/>
     </w:rPr>
   </w:style>
+  <w:style w:type="character" w:styleId="NichtaufgelsteErwhnung">
+    <w:name w:val="Unresolved Mention"/>
+    <w:basedOn w:val="Absatz-Standardschriftart"/>
+    <w:uiPriority w:val="99"/>
+    <w:semiHidden/>
+    <w:unhideWhenUsed/>
+    <w:rsid w:val="00EA782A"/>
+    <w:rPr>
+      <w:color w:val="605E5C"/>
+      <w:shd w:val="clear" w:color="auto" w:fill="E1DFDD"/>
+    </w:rPr>
+  </w:style>
+  <w:style w:type="paragraph" w:customStyle="1" w:styleId="Code">
+    <w:name w:val="Code"/>
+    <w:basedOn w:val="Standard"/>
+    <w:link w:val="CodeZchn"/>
+    <w:qFormat/>
+    <w:rsid w:val="00EA782A"/>
+    <w:pPr>
+      <w:spacing w:after="120" w:line="240" w:lineRule="auto"/>
+    </w:pPr>
+    <w:rPr>
+      <w:rFonts w:ascii="Consolas" w:hAnsi="Consolas"/>
+      <w:sz w:val="20"/>
+      <w:szCs w:val="20"/>
+      <w:lang w:val="en-GB"/>
+    </w:rPr>
+  </w:style>
+  <w:style w:type="character" w:customStyle="1" w:styleId="CodeZchn">
+    <w:name w:val="Code Zchn"/>
+    <w:basedOn w:val="Absatz-Standardschriftart"/>
+    <w:link w:val="Code"/>
+    <w:rsid w:val="00EA782A"/>
+    <w:rPr>
+      <w:rFonts w:ascii="Consolas" w:hAnsi="Consolas"/>
+      <w:lang w:val="en-GB" w:eastAsia="de-DE"/>
+    </w:rPr>
+  </w:style>
 </w:styles>
 </file>
 
@@ -14104,29 +16455,6 @@
 </file>
 
 <file path=customXml/item2.xml><?xml version="1.0" encoding="utf-8"?>
-<b:Sources xmlns:b="http://schemas.openxmlformats.org/officeDocument/2006/bibliography" xmlns="http://schemas.openxmlformats.org/officeDocument/2006/bibliography" SelectedStyle="/IEEE2006OfficeOnline.xsl" StyleName="IEEE" Version="2006">
-  <b:Source>
-    <b:Tag>Don68</b:Tag>
-    <b:SourceType>Book</b:SourceType>
-    <b:Guid>{55A8F394-27D3-C842-96F5-76DF3AB58BAE}</b:Guid>
-    <b:Author>
-      <b:Author>
-        <b:NameList>
-          <b:Person>
-            <b:Last>Knuth</b:Last>
-            <b:First>Donald</b:First>
-          </b:Person>
-        </b:NameList>
-      </b:Author>
-    </b:Author>
-    <b:Title>The Art of Computer Programming</b:Title>
-    <b:Year>1968</b:Year>
-    <b:RefOrder>1</b:RefOrder>
-  </b:Source>
-</b:Sources>
-</file>
-
-<file path=customXml/item3.xml><?xml version="1.0" encoding="utf-8"?>
 <ct:contentTypeSchema xmlns:ct="http://schemas.microsoft.com/office/2006/metadata/contentType" xmlns:ma="http://schemas.microsoft.com/office/2006/metadata/properties/metaAttributes" ct:_="" ma:_="" ma:contentTypeName="Dokument" ma:contentTypeID="0x010100D4D6B2F5FBE1954EB9089AD2A976454D" ma:contentTypeVersion="9" ma:contentTypeDescription="Ein neues Dokument erstellen." ma:contentTypeScope="" ma:versionID="6e2e455e2266c59108c87a5a9345370b">
   <xsd:schema xmlns:xsd="http://www.w3.org/2001/XMLSchema" xmlns:xs="http://www.w3.org/2001/XMLSchema" xmlns:p="http://schemas.microsoft.com/office/2006/metadata/properties" xmlns:ns2="41ab5cc3-df1b-4f60-8d54-469cb8dcee46" targetNamespace="http://schemas.microsoft.com/office/2006/metadata/properties" ma:root="true" ma:fieldsID="840657429f1b223088025e3047606254" ns2:_="">
     <xsd:import namespace="41ab5cc3-df1b-4f60-8d54-469cb8dcee46"/>
@@ -14304,6 +16632,29 @@
 </ct:contentTypeSchema>
 </file>
 
+<file path=customXml/item3.xml><?xml version="1.0" encoding="utf-8"?>
+<b:Sources xmlns:b="http://schemas.openxmlformats.org/officeDocument/2006/bibliography" xmlns="http://schemas.openxmlformats.org/officeDocument/2006/bibliography" SelectedStyle="/IEEE2006OfficeOnline.xsl" StyleName="IEEE" Version="2006">
+  <b:Source>
+    <b:Tag>Don68</b:Tag>
+    <b:SourceType>Book</b:SourceType>
+    <b:Guid>{55A8F394-27D3-C842-96F5-76DF3AB58BAE}</b:Guid>
+    <b:Author>
+      <b:Author>
+        <b:NameList>
+          <b:Person>
+            <b:Last>Knuth</b:Last>
+            <b:First>Donald</b:First>
+          </b:Person>
+        </b:NameList>
+      </b:Author>
+    </b:Author>
+    <b:Title>The Art of Computer Programming</b:Title>
+    <b:Year>1968</b:Year>
+    <b:RefOrder>1</b:RefOrder>
+  </b:Source>
+</b:Sources>
+</file>
+
 <file path=customXml/itemProps1.xml><?xml version="1.0" encoding="utf-8"?>
 <ds:datastoreItem xmlns:ds="http://schemas.openxmlformats.org/officeDocument/2006/customXml" ds:itemID="{F6616987-80FA-3140-A524-FEFC714E2D54}">
   <ds:schemaRefs>
@@ -14313,14 +16664,6 @@
 </file>
 
 <file path=customXml/itemProps2.xml><?xml version="1.0" encoding="utf-8"?>
-<ds:datastoreItem xmlns:ds="http://schemas.openxmlformats.org/officeDocument/2006/customXml" ds:itemID="{C8E39836-654D-BA44-A043-BDB2E8BC3155}">
-  <ds:schemaRefs>
-    <ds:schemaRef ds:uri="http://schemas.openxmlformats.org/officeDocument/2006/bibliography"/>
-  </ds:schemaRefs>
-</ds:datastoreItem>
-</file>
-
-<file path=customXml/itemProps3.xml><?xml version="1.0" encoding="utf-8"?>
 <ds:datastoreItem xmlns:ds="http://schemas.openxmlformats.org/officeDocument/2006/customXml" ds:itemID="{CA7FE024-C325-4E08-A38F-1743A0B74279}">
   <ds:schemaRefs>
     <ds:schemaRef ds:uri="http://schemas.microsoft.com/office/2006/metadata/contentType"/>
@@ -14336,4 +16679,12 @@
     <ds:schemaRef ds:uri="http://schemas.microsoft.com/internal/obd"/>
   </ds:schemaRefs>
 </ds:datastoreItem>
+</file>
+
+<file path=customXml/itemProps3.xml><?xml version="1.0" encoding="utf-8"?>
+<ds:datastoreItem xmlns:ds="http://schemas.openxmlformats.org/officeDocument/2006/customXml" ds:itemID="{C8E39836-654D-BA44-A043-BDB2E8BC3155}">
+  <ds:schemaRefs>
+    <ds:schemaRef ds:uri="http://schemas.openxmlformats.org/officeDocument/2006/bibliography"/>
+  </ds:schemaRefs>
+</ds:datastoreItem>
 </file>
</xml_diff>